<commit_message>
Actualización del documento de especificación
</commit_message>
<xml_diff>
--- a/Documento de especificación.docx
+++ b/Documento de especificación.docx
@@ -639,7 +639,7 @@
           <w:iCs/>
           <w:u w:val="single"/>
         </w:rPr>
-        <w:t xml:space="preserve">Resumen Ejecutivo</w:t>
+        <w:t xml:space="preserve">2. Resumen Ejecutivo</w:t>
       </w:r>
       <w:r>
         <w:rPr>
@@ -697,7 +697,7 @@
           <w:iCs/>
           <w:u w:val="single"/>
         </w:rPr>
-        <w:t xml:space="preserve">Requerimientos Funcionales</w:t>
+        <w:t xml:space="preserve">3. Requerimientos Funcionales</w:t>
       </w:r>
       <w:r>
         <w:rPr>
@@ -1338,7 +1338,7 @@
           <w:iCs/>
           <w:u w:val="single"/>
         </w:rPr>
-        <w:t xml:space="preserve">Requerimientos No Funcionales</w:t>
+        <w:t xml:space="preserve">4. Requerimientos No Funcionales</w:t>
       </w:r>
       <w:r>
         <w:rPr>
@@ -1479,7 +1479,7 @@
           <w:iCs/>
           <w:u w:val="single"/>
         </w:rPr>
-        <w:t xml:space="preserve">Arquitectura del Sistema</w:t>
+        <w:t xml:space="preserve">5. Arquitectura del Sistema</w:t>
       </w:r>
       <w:r>
         <w:rPr>
@@ -1563,6 +1563,13 @@
         <w:t xml:space="preserve">5.3 / 5.4 Estructura de paquetes: * dgtic.core.controller: Controladores MVC (AdministradorController, LoginController) y API REST.  </w:t>
       </w:r>
       <w:r>
+        <w:rPr>
+          <w:b/>
+          <w:bCs/>
+          <w:i/>
+          <w:iCs/>
+          <w:u w:val="single"/>
+        </w:rPr>
         <w:t xml:space="preserve">toma captura del diagrama y pégalo en tu PDF para el punto 5.3 y 5.5</w:t>
       </w:r>
       <w:r>
@@ -1658,20 +1665,1279 @@
       </w:pPr>
       <w:r>
         <w:t xml:space="preserve">dgtic.core.security / config: Clases de seguridad, filtros y providers.</w:t>
+        <w:br/>
+      </w:r>
+      <w:r>
+        <w:rPr>
+          <w:rFonts w:ascii="Times New Roman" w:hAnsi="Times New Roman" w:eastAsia="Times New Roman" w:cs="Times New Roman"/>
+          <w:sz w:val="24"/>
+        </w:rPr>
+      </w:r>
+    </w:p>
+    <w:p>
+      <w:pPr>
+        <w:pStyle w:val="891"/>
+        <w:numPr>
+          <w:ilvl w:val="0"/>
+          <w:numId w:val="4"/>
+        </w:numPr>
+        <w:pBdr>
+          <w:top w:val="none" w:color="000000" w:sz="4" w:space="0"/>
+          <w:left w:val="none" w:color="000000" w:sz="4" w:space="0"/>
+          <w:bottom w:val="none" w:color="000000" w:sz="4" w:space="0"/>
+          <w:right w:val="none" w:color="000000" w:sz="4" w:space="0"/>
+        </w:pBdr>
+        <w:spacing/>
+        <w:ind w:right="0"/>
+        <w:rPr>
+          <w14:ligatures w14:val="none"/>
+        </w:rPr>
+      </w:pPr>
+      <w:r>
+        <w:rPr>
+          <w:lang w:val="undefined"/>
+        </w:rPr>
+        <w:t xml:space="preserve">5.5 Flujo de autenticación (JWT + Refresh Token)</w:t>
+      </w:r>
+      <w:r>
+        <w:rPr>
+          <w:lang w:val="undefined"/>
+        </w:rPr>
+      </w:r>
+    </w:p>
+    <w:p>
+      <w:pPr>
+        <w:pBdr>
+          <w:top w:val="none" w:color="000000" w:sz="4" w:space="0"/>
+          <w:left w:val="none" w:color="000000" w:sz="4" w:space="0"/>
+          <w:bottom w:val="none" w:color="000000" w:sz="4" w:space="0"/>
+          <w:right w:val="none" w:color="000000" w:sz="4" w:space="0"/>
+        </w:pBdr>
+        <w:spacing/>
+        <w:ind w:right="0" w:firstLine="0" w:left="0"/>
+        <w:rPr/>
+      </w:pPr>
+      <w:r>
+        <w:rPr>
+          <w:rFonts w:ascii="Times New Roman" w:hAnsi="Times New Roman" w:eastAsia="Times New Roman" w:cs="Times New Roman"/>
+          <w:color w:val="000000"/>
+          <w:sz w:val="24"/>
+        </w:rPr>
+        <w:t xml:space="preserve">El sistema implementa un mecanismo de autenticación seguro basado en tokens y cookies (</w:t>
+      </w:r>
+      <w:r>
+        <w:rPr>
+          <w:rFonts w:ascii="Times New Roman" w:hAnsi="Times New Roman" w:eastAsia="Times New Roman" w:cs="Times New Roman"/>
+          <w:i/>
+          <w:color w:val="000000"/>
+          <w:sz w:val="24"/>
+        </w:rPr>
+        <w:t xml:space="preserve">Stateless</w:t>
+      </w:r>
+      <w:r>
+        <w:rPr>
+          <w:rFonts w:ascii="Times New Roman" w:hAnsi="Times New Roman" w:eastAsia="Times New Roman" w:cs="Times New Roman"/>
+          <w:color w:val="000000"/>
+          <w:sz w:val="24"/>
+        </w:rPr>
+        <w:t xml:space="preserve">), eliminando la dependencia de las sesiones tradicionales en la memoria del servidor. El ciclo de vida de la autenticación sigue este flujo:</w:t>
       </w:r>
       <w:r/>
     </w:p>
     <w:p>
       <w:pPr>
-        <w:pBdr/>
-        <w:spacing/>
-        <w:ind/>
-        <w:jc w:val="both"/>
+        <w:pStyle w:val="891"/>
+        <w:numPr>
+          <w:ilvl w:val="0"/>
+          <w:numId w:val="5"/>
+        </w:numPr>
+        <w:pBdr>
+          <w:top w:val="none" w:color="000000" w:sz="4" w:space="0"/>
+          <w:left w:val="none" w:color="000000" w:sz="4" w:space="0"/>
+          <w:bottom w:val="none" w:color="000000" w:sz="4" w:space="0"/>
+          <w:right w:val="none" w:color="000000" w:sz="4" w:space="0"/>
+        </w:pBdr>
+        <w:spacing/>
+        <w:ind w:right="0"/>
+        <w:rPr/>
+      </w:pPr>
+      <w:r>
         <w:rPr>
-          <w:b w:val="0"/>
-          <w:bCs w:val="0"/>
-          <w:i w:val="0"/>
-          <w:u w:val="none"/>
+          <w:rFonts w:ascii="Times New Roman" w:hAnsi="Times New Roman" w:eastAsia="Times New Roman" w:cs="Times New Roman"/>
+          <w:b/>
+          <w:color w:val="000000"/>
+          <w:sz w:val="24"/>
+        </w:rPr>
+        <w:t xml:space="preserve">Autenticación Inicial (Login):</w:t>
+      </w:r>
+      <w:r>
+        <w:rPr>
+          <w:rFonts w:ascii="Times New Roman" w:hAnsi="Times New Roman" w:eastAsia="Times New Roman" w:cs="Times New Roman"/>
+          <w:color w:val="000000"/>
+          <w:sz w:val="24"/>
+        </w:rPr>
+        <w:t xml:space="preserve"> El usuario envía sus credenciales (correo y contraseña) a través de la vista de Thymeleaf. El </w:t>
+      </w:r>
+      <w:r>
+        <w:rPr>
+          <w:rFonts w:ascii="Courier New" w:hAnsi="Courier New" w:eastAsia="Courier New" w:cs="Courier New"/>
+          <w:color w:val="000000"/>
+          <w:sz w:val="20"/>
+        </w:rPr>
+        <w:t xml:space="preserve">LoginController</w:t>
+      </w:r>
+      <w:r>
+        <w:rPr>
+          <w:rFonts w:ascii="Times New Roman" w:hAnsi="Times New Roman" w:eastAsia="Times New Roman" w:cs="Times New Roman"/>
+          <w:color w:val="000000"/>
+          <w:sz w:val="24"/>
+        </w:rPr>
+        <w:t xml:space="preserve"> delega esta información al </w:t>
+      </w:r>
+      <w:r>
+        <w:rPr>
+          <w:rFonts w:ascii="Courier New" w:hAnsi="Courier New" w:eastAsia="Courier New" w:cs="Courier New"/>
+          <w:color w:val="000000"/>
+          <w:sz w:val="20"/>
+        </w:rPr>
+        <w:t xml:space="preserve">AuthenticationManager</w:t>
+      </w:r>
+      <w:r>
+        <w:rPr>
+          <w:rFonts w:ascii="Times New Roman" w:hAnsi="Times New Roman" w:eastAsia="Times New Roman" w:cs="Times New Roman"/>
+          <w:color w:val="000000"/>
+          <w:sz w:val="24"/>
+        </w:rPr>
+        <w:t xml:space="preserve"> de Spring Security, el cual verifica la existencia y validez del usuario contra la base de datos MariaDB.</w:t>
+      </w:r>
+      <w:r/>
+    </w:p>
+    <w:p>
+      <w:pPr>
+        <w:pStyle w:val="891"/>
+        <w:numPr>
+          <w:ilvl w:val="0"/>
+          <w:numId w:val="5"/>
+        </w:numPr>
+        <w:pBdr>
+          <w:top w:val="none" w:color="000000" w:sz="4" w:space="0"/>
+          <w:left w:val="none" w:color="000000" w:sz="4" w:space="0"/>
+          <w:bottom w:val="none" w:color="000000" w:sz="4" w:space="0"/>
+          <w:right w:val="none" w:color="000000" w:sz="4" w:space="0"/>
+        </w:pBdr>
+        <w:spacing/>
+        <w:ind w:right="0"/>
+        <w:rPr/>
+      </w:pPr>
+      <w:r>
+        <w:rPr>
+          <w:rFonts w:ascii="Times New Roman" w:hAnsi="Times New Roman" w:eastAsia="Times New Roman" w:cs="Times New Roman"/>
+          <w:b/>
+          <w:color w:val="000000"/>
+          <w:sz w:val="24"/>
+        </w:rPr>
+        <w:t xml:space="preserve">Generación de Tokens:</w:t>
+      </w:r>
+      <w:r>
+        <w:rPr>
+          <w:rFonts w:ascii="Times New Roman" w:hAnsi="Times New Roman" w:eastAsia="Times New Roman" w:cs="Times New Roman"/>
+          <w:color w:val="000000"/>
+          <w:sz w:val="24"/>
+        </w:rPr>
+        <w:t xml:space="preserve"> Una vez validada la identidad, la clase </w:t>
+      </w:r>
+      <w:r>
+        <w:rPr>
+          <w:rFonts w:ascii="Courier New" w:hAnsi="Courier New" w:eastAsia="Courier New" w:cs="Courier New"/>
+          <w:color w:val="000000"/>
+          <w:sz w:val="20"/>
+        </w:rPr>
+        <w:t xml:space="preserve">JWTTokenProvider</w:t>
+      </w:r>
+      <w:r>
+        <w:rPr>
+          <w:rFonts w:ascii="Times New Roman" w:hAnsi="Times New Roman" w:eastAsia="Times New Roman" w:cs="Times New Roman"/>
+          <w:color w:val="000000"/>
+          <w:sz w:val="24"/>
+        </w:rPr>
+        <w:t xml:space="preserve"> entra en acción y genera dos tokens firmados criptográficamente (algoritmo HS256):</w:t>
+      </w:r>
+      <w:r/>
+    </w:p>
+    <w:p>
+      <w:pPr>
+        <w:pStyle w:val="891"/>
+        <w:numPr>
+          <w:ilvl w:val="1"/>
+          <w:numId w:val="6"/>
+        </w:numPr>
+        <w:pBdr>
+          <w:top w:val="none" w:color="000000" w:sz="4" w:space="0"/>
+          <w:left w:val="none" w:color="000000" w:sz="4" w:space="0"/>
+          <w:bottom w:val="none" w:color="000000" w:sz="4" w:space="0"/>
+          <w:right w:val="none" w:color="000000" w:sz="4" w:space="0"/>
+        </w:pBdr>
+        <w:spacing/>
+        <w:ind w:right="0"/>
+        <w:rPr/>
+      </w:pPr>
+      <w:r>
+        <w:rPr>
+          <w:rFonts w:ascii="Times New Roman" w:hAnsi="Times New Roman" w:eastAsia="Times New Roman" w:cs="Times New Roman"/>
+          <w:b/>
+          <w:color w:val="000000"/>
+          <w:sz w:val="24"/>
+        </w:rPr>
+        <w:t xml:space="preserve">Access Token:</w:t>
+      </w:r>
+      <w:r>
+        <w:rPr>
+          <w:rFonts w:ascii="Times New Roman" w:hAnsi="Times New Roman" w:eastAsia="Times New Roman" w:cs="Times New Roman"/>
+          <w:color w:val="000000"/>
+          <w:sz w:val="24"/>
+        </w:rPr>
+        <w:t xml:space="preserve"> Token de corta duración (15 minutos) que contiene el </w:t>
+      </w:r>
+      <w:r>
+        <w:rPr>
+          <w:rFonts w:ascii="Times New Roman" w:hAnsi="Times New Roman" w:eastAsia="Times New Roman" w:cs="Times New Roman"/>
+          <w:i/>
+          <w:color w:val="000000"/>
+          <w:sz w:val="24"/>
+        </w:rPr>
+        <w:t xml:space="preserve">subject</w:t>
+      </w:r>
+      <w:r>
+        <w:rPr>
+          <w:rFonts w:ascii="Times New Roman" w:hAnsi="Times New Roman" w:eastAsia="Times New Roman" w:cs="Times New Roman"/>
+          <w:color w:val="000000"/>
+          <w:sz w:val="24"/>
+        </w:rPr>
+        <w:t xml:space="preserve"> del usuario y se utiliza para autorizar el acceso inmediato a los recursos.</w:t>
+      </w:r>
+      <w:r/>
+    </w:p>
+    <w:p>
+      <w:pPr>
+        <w:pStyle w:val="891"/>
+        <w:numPr>
+          <w:ilvl w:val="1"/>
+          <w:numId w:val="6"/>
+        </w:numPr>
+        <w:pBdr>
+          <w:top w:val="none" w:color="000000" w:sz="4" w:space="0"/>
+          <w:left w:val="none" w:color="000000" w:sz="4" w:space="0"/>
+          <w:bottom w:val="none" w:color="000000" w:sz="4" w:space="0"/>
+          <w:right w:val="none" w:color="000000" w:sz="4" w:space="0"/>
+        </w:pBdr>
+        <w:spacing/>
+        <w:ind w:right="0"/>
+        <w:rPr/>
+      </w:pPr>
+      <w:r>
+        <w:rPr>
+          <w:rFonts w:ascii="Times New Roman" w:hAnsi="Times New Roman" w:eastAsia="Times New Roman" w:cs="Times New Roman"/>
+          <w:b/>
+          <w:color w:val="000000"/>
+          <w:sz w:val="24"/>
+        </w:rPr>
+        <w:t xml:space="preserve">Refresh Token:</w:t>
+      </w:r>
+      <w:r>
+        <w:rPr>
+          <w:rFonts w:ascii="Times New Roman" w:hAnsi="Times New Roman" w:eastAsia="Times New Roman" w:cs="Times New Roman"/>
+          <w:color w:val="000000"/>
+          <w:sz w:val="24"/>
+        </w:rPr>
+        <w:t xml:space="preserve"> Token de larga duración (7 días) utilizado como respaldo.</w:t>
+      </w:r>
+      <w:r/>
+    </w:p>
+    <w:p>
+      <w:pPr>
+        <w:pStyle w:val="891"/>
+        <w:numPr>
+          <w:ilvl w:val="0"/>
+          <w:numId w:val="7"/>
+        </w:numPr>
+        <w:pBdr>
+          <w:top w:val="none" w:color="000000" w:sz="4" w:space="0"/>
+          <w:left w:val="none" w:color="000000" w:sz="4" w:space="0"/>
+          <w:bottom w:val="none" w:color="000000" w:sz="4" w:space="0"/>
+          <w:right w:val="none" w:color="000000" w:sz="4" w:space="0"/>
+        </w:pBdr>
+        <w:spacing/>
+        <w:ind w:right="0"/>
+        <w:rPr/>
+      </w:pPr>
+      <w:r>
+        <w:rPr>
+          <w:rFonts w:ascii="Times New Roman" w:hAnsi="Times New Roman" w:eastAsia="Times New Roman" w:cs="Times New Roman"/>
+          <w:b/>
+          <w:color w:val="000000"/>
+          <w:sz w:val="24"/>
+        </w:rPr>
+        <w:t xml:space="preserve">Inyección en Cookies (Protección XSS):</w:t>
+      </w:r>
+      <w:r>
+        <w:rPr>
+          <w:rFonts w:ascii="Times New Roman" w:hAnsi="Times New Roman" w:eastAsia="Times New Roman" w:cs="Times New Roman"/>
+          <w:color w:val="000000"/>
+          <w:sz w:val="24"/>
+        </w:rPr>
+        <w:t xml:space="preserve"> Para permitir una navegación fluida con las vistas de Thymeleaf sin exponer los tokens, el servidor encapsula el </w:t>
+      </w:r>
+      <w:r>
+        <w:rPr>
+          <w:rFonts w:ascii="Times New Roman" w:hAnsi="Times New Roman" w:eastAsia="Times New Roman" w:cs="Times New Roman"/>
+          <w:i/>
+          <w:color w:val="000000"/>
+          <w:sz w:val="24"/>
+        </w:rPr>
+        <w:t xml:space="preserve">Access Token</w:t>
+      </w:r>
+      <w:r>
+        <w:rPr>
+          <w:rFonts w:ascii="Times New Roman" w:hAnsi="Times New Roman" w:eastAsia="Times New Roman" w:cs="Times New Roman"/>
+          <w:color w:val="000000"/>
+          <w:sz w:val="24"/>
+        </w:rPr>
+        <w:t xml:space="preserve"> y el </w:t>
+      </w:r>
+      <w:r>
+        <w:rPr>
+          <w:rFonts w:ascii="Times New Roman" w:hAnsi="Times New Roman" w:eastAsia="Times New Roman" w:cs="Times New Roman"/>
+          <w:i/>
+          <w:color w:val="000000"/>
+          <w:sz w:val="24"/>
+        </w:rPr>
+        <w:t xml:space="preserve">Refresh Token</w:t>
+      </w:r>
+      <w:r>
+        <w:rPr>
+          <w:rFonts w:ascii="Times New Roman" w:hAnsi="Times New Roman" w:eastAsia="Times New Roman" w:cs="Times New Roman"/>
+          <w:color w:val="000000"/>
+          <w:sz w:val="24"/>
+        </w:rPr>
+        <w:t xml:space="preserve"> dentro de </w:t>
+      </w:r>
+      <w:r>
+        <w:rPr>
+          <w:rFonts w:ascii="Times New Roman" w:hAnsi="Times New Roman" w:eastAsia="Times New Roman" w:cs="Times New Roman"/>
+          <w:b/>
+          <w:color w:val="000000"/>
+          <w:sz w:val="24"/>
+        </w:rPr>
+        <w:t xml:space="preserve">Cookies con la bandera HttpOnly</w:t>
+      </w:r>
+      <w:r>
+        <w:rPr>
+          <w:rFonts w:ascii="Times New Roman" w:hAnsi="Times New Roman" w:eastAsia="Times New Roman" w:cs="Times New Roman"/>
+          <w:color w:val="000000"/>
+          <w:sz w:val="24"/>
+        </w:rPr>
+        <w:t xml:space="preserve">. Esto garantiza que el navegador envíe los tokens automáticamente en cada petición, impidiendo al mismo tiempo que scripts maliciosos de JavaScript puedan leerlos.</w:t>
+      </w:r>
+      <w:r/>
+    </w:p>
+    <w:p>
+      <w:pPr>
+        <w:pStyle w:val="891"/>
+        <w:numPr>
+          <w:ilvl w:val="0"/>
+          <w:numId w:val="7"/>
+        </w:numPr>
+        <w:pBdr>
+          <w:top w:val="none" w:color="000000" w:sz="4" w:space="0"/>
+          <w:left w:val="none" w:color="000000" w:sz="4" w:space="0"/>
+          <w:bottom w:val="none" w:color="000000" w:sz="4" w:space="0"/>
+          <w:right w:val="none" w:color="000000" w:sz="4" w:space="0"/>
+        </w:pBdr>
+        <w:spacing/>
+        <w:ind w:right="0"/>
+        <w:rPr/>
+      </w:pPr>
+      <w:r>
+        <w:rPr>
+          <w:rFonts w:ascii="Times New Roman" w:hAnsi="Times New Roman" w:eastAsia="Times New Roman" w:cs="Times New Roman"/>
+          <w:b/>
+          <w:color w:val="000000"/>
+          <w:sz w:val="24"/>
+        </w:rPr>
+        <w:t xml:space="preserve">Validación Transaccional:</w:t>
+      </w:r>
+      <w:r>
+        <w:rPr>
+          <w:rFonts w:ascii="Times New Roman" w:hAnsi="Times New Roman" w:eastAsia="Times New Roman" w:cs="Times New Roman"/>
+          <w:color w:val="000000"/>
+          <w:sz w:val="24"/>
+        </w:rPr>
+        <w:t xml:space="preserve"> En cada petición subsecuente (ej. navegar a la lista de grupos), el navegador envía la cookie. El filtro personalizado </w:t>
+      </w:r>
+      <w:r>
+        <w:rPr>
+          <w:rFonts w:ascii="Courier New" w:hAnsi="Courier New" w:eastAsia="Courier New" w:cs="Courier New"/>
+          <w:color w:val="000000"/>
+          <w:sz w:val="20"/>
+        </w:rPr>
+        <w:t xml:space="preserve">JwtAuthenticationFilter</w:t>
+      </w:r>
+      <w:r>
+        <w:rPr>
+          <w:rFonts w:ascii="Times New Roman" w:hAnsi="Times New Roman" w:eastAsia="Times New Roman" w:cs="Times New Roman"/>
+          <w:color w:val="000000"/>
+          <w:sz w:val="24"/>
+        </w:rPr>
+        <w:t xml:space="preserve"> intercepta la solicitud, extrae la cookie </w:t>
+      </w:r>
+      <w:r>
+        <w:rPr>
+          <w:rFonts w:ascii="Courier New" w:hAnsi="Courier New" w:eastAsia="Courier New" w:cs="Courier New"/>
+          <w:color w:val="000000"/>
+          <w:sz w:val="20"/>
+        </w:rPr>
+        <w:t xml:space="preserve">accessToken</w:t>
+      </w:r>
+      <w:r>
+        <w:rPr>
+          <w:rFonts w:ascii="Times New Roman" w:hAnsi="Times New Roman" w:eastAsia="Times New Roman" w:cs="Times New Roman"/>
+          <w:color w:val="000000"/>
+          <w:sz w:val="24"/>
+        </w:rPr>
+        <w:t xml:space="preserve">, valida la firma secreta y su fecha de expiración. Si el token es válido, se reconstruye la identidad del usuario y se inyecta en el </w:t>
+      </w:r>
+      <w:r>
+        <w:rPr>
+          <w:rFonts w:ascii="Courier New" w:hAnsi="Courier New" w:eastAsia="Courier New" w:cs="Courier New"/>
+          <w:color w:val="000000"/>
+          <w:sz w:val="20"/>
+        </w:rPr>
+        <w:t xml:space="preserve">SecurityContextHolder</w:t>
+      </w:r>
+      <w:r>
+        <w:rPr>
+          <w:rFonts w:ascii="Times New Roman" w:hAnsi="Times New Roman" w:eastAsia="Times New Roman" w:cs="Times New Roman"/>
+          <w:color w:val="000000"/>
+          <w:sz w:val="24"/>
+        </w:rPr>
+        <w:t xml:space="preserve">, permitiendo el acceso al recurso solicitado.</w:t>
+      </w:r>
+      <w:r/>
+    </w:p>
+    <w:p>
+      <w:pPr>
+        <w:pStyle w:val="891"/>
+        <w:numPr>
+          <w:ilvl w:val="0"/>
+          <w:numId w:val="7"/>
+        </w:numPr>
+        <w:pBdr>
+          <w:top w:val="none" w:color="000000" w:sz="4" w:space="0"/>
+          <w:left w:val="none" w:color="000000" w:sz="4" w:space="0"/>
+          <w:bottom w:val="none" w:color="000000" w:sz="4" w:space="0"/>
+          <w:right w:val="none" w:color="000000" w:sz="4" w:space="0"/>
+        </w:pBdr>
+        <w:spacing/>
+        <w:ind w:right="0"/>
+        <w:rPr/>
+      </w:pPr>
+      <w:r>
+        <w:rPr>
+          <w:rFonts w:ascii="Times New Roman" w:hAnsi="Times New Roman" w:eastAsia="Times New Roman" w:cs="Times New Roman"/>
+          <w:b/>
+          <w:color w:val="000000"/>
+          <w:sz w:val="24"/>
+        </w:rPr>
+      </w:r>
+      <w:r>
+        <mc:AlternateContent>
+          <mc:Choice Requires="wpg">
+            <w:drawing>
+              <wp:anchor xmlns:wp="http://schemas.openxmlformats.org/drawingml/2006/wordprocessingDrawing" xmlns:wp14="http://schemas.microsoft.com/office/word/2010/wordprocessingDrawing" distT="0" distB="0" distL="115200" distR="115200" simplePos="0" relativeHeight="251668480" behindDoc="0" locked="0" layoutInCell="1" allowOverlap="1">
+                <wp:simplePos x="0" y="0"/>
+                <wp:positionH relativeFrom="column">
+                  <wp:posOffset>-197700</wp:posOffset>
+                </wp:positionH>
+                <wp:positionV relativeFrom="paragraph">
+                  <wp:posOffset>875977</wp:posOffset>
+                </wp:positionV>
+                <wp:extent cx="5940425" cy="3369811"/>
+                <wp:effectExtent l="0" t="0" r="0" b="0"/>
+                <wp:wrapNone/>
+                <wp:docPr id="2" name=""/>
+                <wp:cNvGraphicFramePr>
+                  <a:graphicFrameLocks xmlns:a="http://schemas.openxmlformats.org/drawingml/2006/main" noChangeAspect="1"/>
+                </wp:cNvGraphicFramePr>
+                <a:graphic xmlns:a="http://schemas.openxmlformats.org/drawingml/2006/main">
+                  <a:graphicData uri="http://schemas.openxmlformats.org/drawingml/2006/picture">
+                    <pic:pic xmlns:pic="http://schemas.openxmlformats.org/drawingml/2006/picture">
+                      <pic:nvPicPr>
+                        <pic:cNvPr id="357166273" name=""/>
+                        <pic:cNvPicPr>
+                          <a:picLocks noChangeAspect="1"/>
+                        </pic:cNvPicPr>
+                        <pic:nvPr/>
+                      </pic:nvPicPr>
+                      <pic:blipFill rotWithShape="1">
+                        <a:blip r:embed="rId10"/>
+                        <a:stretch/>
+                      </pic:blipFill>
+                      <pic:spPr bwMode="auto">
+                        <a:xfrm>
+                          <a:off x="0" y="0"/>
+                          <a:ext cx="5940424" cy="3369810"/>
+                        </a:xfrm>
+                        <a:prstGeom prst="rect">
+                          <a:avLst/>
+                        </a:prstGeom>
+                      </pic:spPr>
+                    </pic:pic>
+                  </a:graphicData>
+                </a:graphic>
+              </wp:anchor>
+            </w:drawing>
+          </mc:Choice>
+          <mc:Fallback>
+            <w:pict>
+              <v:shapetype id="_x0000_t75" coordsize="21600,21600" o:spt="75" o:preferrelative="t" path="m@4@5l@4@11@9@11@9@5xe" filled="f" stroked="f">
+                <v:stroke joinstyle="miter"/>
+                <v:formulas>
+                  <v:f eqn="if lineDrawn pixelLineWidth 0"/>
+                  <v:f eqn="sum @0 1 0"/>
+                  <v:f eqn="sum 0 0 @1"/>
+                  <v:f eqn="prod @2 1 2"/>
+                  <v:f eqn="prod @3 21600 pixelWidth"/>
+                  <v:f eqn="prod @3 21600 pixelHeight"/>
+                  <v:f eqn="sum @0 0 1"/>
+                  <v:f eqn="prod @6 1 2"/>
+                  <v:f eqn="prod @7 21600 pixelWidth"/>
+                  <v:f eqn="sum @8 21600 0"/>
+                  <v:f eqn="prod @7 21600 pixelHeight"/>
+                  <v:f eqn="sum @10 21600 0"/>
+                </v:formulas>
+                <v:path o:extrusionok="f" gradientshapeok="t" o:connecttype="rect"/>
+                <o:lock v:ext="edit" aspectratio="t"/>
+              </v:shapetype>
+              <v:shape id="_x0000_i1" o:spid="_x0000_s1" type="#_x0000_t75" style="position:absolute;z-index:251668480;o:allowoverlap:true;o:allowincell:true;mso-position-horizontal-relative:text;margin-left:-15.57pt;mso-position-horizontal:absolute;mso-position-vertical-relative:text;margin-top:68.97pt;mso-position-vertical:absolute;width:467.75pt;height:265.34pt;mso-wrap-distance-left:9.07pt;mso-wrap-distance-top:0.00pt;mso-wrap-distance-right:9.07pt;mso-wrap-distance-bottom:0.00pt;z-index:1;" stroked="false">
+                <v:imagedata r:id="rId10" o:title=""/>
+                <o:lock v:ext="edit" rotation="t"/>
+              </v:shape>
+            </w:pict>
+          </mc:Fallback>
+        </mc:AlternateContent>
+      </w:r>
+      <w:r>
+        <w:rPr>
+          <w:rFonts w:ascii="Times New Roman" w:hAnsi="Times New Roman" w:eastAsia="Times New Roman" w:cs="Times New Roman"/>
+          <w:b/>
+          <w:color w:val="000000"/>
+          <w:sz w:val="24"/>
+        </w:rPr>
+        <w:t xml:space="preserve">Ciclo de Renovación:</w:t>
+      </w:r>
+      <w:r>
+        <w:rPr>
+          <w:rFonts w:ascii="Times New Roman" w:hAnsi="Times New Roman" w:eastAsia="Times New Roman" w:cs="Times New Roman"/>
+          <w:color w:val="000000"/>
+          <w:sz w:val="24"/>
+        </w:rPr>
+        <w:t xml:space="preserve"> Cuando el </w:t>
+      </w:r>
+      <w:r>
+        <w:rPr>
+          <w:rFonts w:ascii="Times New Roman" w:hAnsi="Times New Roman" w:eastAsia="Times New Roman" w:cs="Times New Roman"/>
+          <w:i/>
+          <w:color w:val="000000"/>
+          <w:sz w:val="24"/>
+        </w:rPr>
+        <w:t xml:space="preserve">Access Token</w:t>
+      </w:r>
+      <w:r>
+        <w:rPr>
+          <w:rFonts w:ascii="Times New Roman" w:hAnsi="Times New Roman" w:eastAsia="Times New Roman" w:cs="Times New Roman"/>
+          <w:color w:val="000000"/>
+          <w:sz w:val="24"/>
+        </w:rPr>
+        <w:t xml:space="preserve"> expira, la arquitectura contempla el uso del </w:t>
+      </w:r>
+      <w:r>
+        <w:rPr>
+          <w:rFonts w:ascii="Times New Roman" w:hAnsi="Times New Roman" w:eastAsia="Times New Roman" w:cs="Times New Roman"/>
+          <w:i/>
+          <w:color w:val="000000"/>
+          <w:sz w:val="24"/>
+        </w:rPr>
+        <w:t xml:space="preserve">Refresh Token</w:t>
+      </w:r>
+      <w:r>
+        <w:rPr>
+          <w:rFonts w:ascii="Times New Roman" w:hAnsi="Times New Roman" w:eastAsia="Times New Roman" w:cs="Times New Roman"/>
+          <w:color w:val="000000"/>
+          <w:sz w:val="24"/>
+        </w:rPr>
+        <w:t xml:space="preserve"> (que aún sigue vigente en su respectiva cookie) para solicitar silenciosamente un nuevo </w:t>
+      </w:r>
+      <w:r>
+        <w:rPr>
+          <w:rFonts w:ascii="Times New Roman" w:hAnsi="Times New Roman" w:eastAsia="Times New Roman" w:cs="Times New Roman"/>
+          <w:i/>
+          <w:color w:val="000000"/>
+          <w:sz w:val="24"/>
+        </w:rPr>
+        <w:t xml:space="preserve">Access Token</w:t>
+      </w:r>
+      <w:r>
+        <w:rPr>
+          <w:rFonts w:ascii="Times New Roman" w:hAnsi="Times New Roman" w:eastAsia="Times New Roman" w:cs="Times New Roman"/>
+          <w:color w:val="000000"/>
+          <w:sz w:val="24"/>
+        </w:rPr>
+        <w:t xml:space="preserve">. Esto mantiene un alto estándar de seguridad (tokens de vida corta) sin degradar la experiencia de navegación del usuario.</w:t>
+      </w:r>
+      <w:r>
+        <w:rPr>
+          <w:rFonts w:ascii="Times New Roman" w:hAnsi="Times New Roman" w:eastAsia="Times New Roman" w:cs="Times New Roman"/>
+          <w:sz w:val="24"/>
+        </w:rPr>
+      </w:r>
+    </w:p>
+    <w:p>
+      <w:pPr>
+        <w:pBdr>
+          <w:top w:val="none" w:color="000000" w:sz="4" w:space="0"/>
+          <w:left w:val="none" w:color="000000" w:sz="4" w:space="0"/>
+          <w:bottom w:val="none" w:color="000000" w:sz="4" w:space="0"/>
+          <w:right w:val="none" w:color="000000" w:sz="4" w:space="0"/>
+        </w:pBdr>
+        <w:spacing/>
+        <w:ind w:right="0"/>
+        <w:rPr>
+          <w:rFonts w:ascii="Times New Roman" w:hAnsi="Times New Roman" w:eastAsia="Times New Roman" w:cs="Times New Roman"/>
+          <w:sz w:val="24"/>
+          <w:szCs w:val="24"/>
+        </w:rPr>
+      </w:pPr>
+      <w:r>
+        <w:rPr>
+          <w:rFonts w:ascii="Times New Roman" w:hAnsi="Times New Roman" w:eastAsia="Times New Roman" w:cs="Times New Roman"/>
+          <w:sz w:val="24"/>
+          <w:szCs w:val="24"/>
+        </w:rPr>
+      </w:r>
+      <w:r>
+        <w:rPr>
+          <w:rFonts w:ascii="Times New Roman" w:hAnsi="Times New Roman" w:eastAsia="Times New Roman" w:cs="Times New Roman"/>
+          <w:sz w:val="24"/>
+          <w:szCs w:val="24"/>
+        </w:rPr>
+      </w:r>
+      <w:r>
+        <w:rPr>
+          <w:rFonts w:ascii="Times New Roman" w:hAnsi="Times New Roman" w:eastAsia="Times New Roman" w:cs="Times New Roman"/>
+          <w:sz w:val="24"/>
+          <w:szCs w:val="24"/>
+        </w:rPr>
+      </w:r>
+    </w:p>
+    <w:p>
+      <w:pPr>
+        <w:pBdr>
+          <w:top w:val="none" w:color="000000" w:sz="4" w:space="0"/>
+          <w:left w:val="none" w:color="000000" w:sz="4" w:space="0"/>
+          <w:bottom w:val="none" w:color="000000" w:sz="4" w:space="0"/>
+          <w:right w:val="none" w:color="000000" w:sz="4" w:space="0"/>
+        </w:pBdr>
+        <w:spacing/>
+        <w:ind w:right="0"/>
+        <w:rPr>
+          <w:rFonts w:ascii="Times New Roman" w:hAnsi="Times New Roman" w:eastAsia="Times New Roman" w:cs="Times New Roman"/>
+          <w:sz w:val="24"/>
+          <w:szCs w:val="24"/>
+        </w:rPr>
+      </w:pPr>
+      <w:r>
+        <w:rPr>
+          <w:rFonts w:ascii="Times New Roman" w:hAnsi="Times New Roman" w:eastAsia="Times New Roman" w:cs="Times New Roman"/>
+          <w:sz w:val="24"/>
+          <w:szCs w:val="24"/>
+        </w:rPr>
+      </w:r>
+      <w:r>
+        <w:rPr>
+          <w:rFonts w:ascii="Times New Roman" w:hAnsi="Times New Roman" w:eastAsia="Times New Roman" w:cs="Times New Roman"/>
+          <w:sz w:val="24"/>
+          <w:szCs w:val="24"/>
+        </w:rPr>
+      </w:r>
+      <w:r>
+        <w:rPr>
+          <w:rFonts w:ascii="Times New Roman" w:hAnsi="Times New Roman" w:eastAsia="Times New Roman" w:cs="Times New Roman"/>
+          <w:sz w:val="24"/>
+          <w:szCs w:val="24"/>
+        </w:rPr>
+      </w:r>
+    </w:p>
+    <w:p>
+      <w:pPr>
+        <w:pBdr>
+          <w:top w:val="none" w:color="000000" w:sz="4" w:space="0"/>
+          <w:left w:val="none" w:color="000000" w:sz="4" w:space="0"/>
+          <w:bottom w:val="none" w:color="000000" w:sz="4" w:space="0"/>
+          <w:right w:val="none" w:color="000000" w:sz="4" w:space="0"/>
+        </w:pBdr>
+        <w:spacing/>
+        <w:ind w:right="0"/>
+        <w:rPr>
+          <w:rFonts w:ascii="Times New Roman" w:hAnsi="Times New Roman" w:eastAsia="Times New Roman" w:cs="Times New Roman"/>
+          <w:sz w:val="24"/>
+          <w:szCs w:val="24"/>
+        </w:rPr>
+      </w:pPr>
+      <w:r>
+        <w:rPr>
+          <w:rFonts w:ascii="Times New Roman" w:hAnsi="Times New Roman" w:eastAsia="Times New Roman" w:cs="Times New Roman"/>
+          <w:sz w:val="24"/>
+          <w:szCs w:val="24"/>
+        </w:rPr>
+      </w:r>
+      <w:r>
+        <w:rPr>
+          <w:rFonts w:ascii="Times New Roman" w:hAnsi="Times New Roman" w:eastAsia="Times New Roman" w:cs="Times New Roman"/>
+          <w:sz w:val="24"/>
+          <w:szCs w:val="24"/>
+        </w:rPr>
+      </w:r>
+      <w:r>
+        <w:rPr>
+          <w:rFonts w:ascii="Times New Roman" w:hAnsi="Times New Roman" w:eastAsia="Times New Roman" w:cs="Times New Roman"/>
+          <w:sz w:val="24"/>
+          <w:szCs w:val="24"/>
+        </w:rPr>
+      </w:r>
+    </w:p>
+    <w:p>
+      <w:pPr>
+        <w:pBdr>
+          <w:top w:val="none" w:color="000000" w:sz="4" w:space="0"/>
+          <w:left w:val="none" w:color="000000" w:sz="4" w:space="0"/>
+          <w:bottom w:val="none" w:color="000000" w:sz="4" w:space="0"/>
+          <w:right w:val="none" w:color="000000" w:sz="4" w:space="0"/>
+        </w:pBdr>
+        <w:spacing/>
+        <w:ind w:right="0"/>
+        <w:rPr>
+          <w:rFonts w:ascii="Times New Roman" w:hAnsi="Times New Roman" w:eastAsia="Times New Roman" w:cs="Times New Roman"/>
+          <w:sz w:val="24"/>
+          <w:szCs w:val="24"/>
+        </w:rPr>
+      </w:pPr>
+      <w:r>
+        <w:rPr>
+          <w:rFonts w:ascii="Times New Roman" w:hAnsi="Times New Roman" w:eastAsia="Times New Roman" w:cs="Times New Roman"/>
+          <w:sz w:val="24"/>
+          <w:szCs w:val="24"/>
+        </w:rPr>
+      </w:r>
+      <w:r>
+        <w:rPr>
+          <w:rFonts w:ascii="Times New Roman" w:hAnsi="Times New Roman" w:eastAsia="Times New Roman" w:cs="Times New Roman"/>
+          <w:sz w:val="24"/>
+          <w:szCs w:val="24"/>
+        </w:rPr>
+      </w:r>
+      <w:r>
+        <w:rPr>
+          <w:rFonts w:ascii="Times New Roman" w:hAnsi="Times New Roman" w:eastAsia="Times New Roman" w:cs="Times New Roman"/>
+          <w:sz w:val="24"/>
+          <w:szCs w:val="24"/>
+        </w:rPr>
+      </w:r>
+    </w:p>
+    <w:p>
+      <w:pPr>
+        <w:pBdr>
+          <w:top w:val="none" w:color="000000" w:sz="4" w:space="0"/>
+          <w:left w:val="none" w:color="000000" w:sz="4" w:space="0"/>
+          <w:bottom w:val="none" w:color="000000" w:sz="4" w:space="0"/>
+          <w:right w:val="none" w:color="000000" w:sz="4" w:space="0"/>
+        </w:pBdr>
+        <w:spacing/>
+        <w:ind w:right="0"/>
+        <w:rPr>
+          <w:rFonts w:ascii="Times New Roman" w:hAnsi="Times New Roman" w:eastAsia="Times New Roman" w:cs="Times New Roman"/>
+          <w:sz w:val="24"/>
+          <w:szCs w:val="24"/>
+        </w:rPr>
+      </w:pPr>
+      <w:r>
+        <w:rPr>
+          <w:rFonts w:ascii="Times New Roman" w:hAnsi="Times New Roman" w:eastAsia="Times New Roman" w:cs="Times New Roman"/>
+          <w:sz w:val="24"/>
+          <w:szCs w:val="24"/>
+        </w:rPr>
+      </w:r>
+      <w:r>
+        <w:rPr>
+          <w:rFonts w:ascii="Times New Roman" w:hAnsi="Times New Roman" w:eastAsia="Times New Roman" w:cs="Times New Roman"/>
+          <w:sz w:val="24"/>
+          <w:szCs w:val="24"/>
+        </w:rPr>
+      </w:r>
+      <w:r>
+        <w:rPr>
+          <w:rFonts w:ascii="Times New Roman" w:hAnsi="Times New Roman" w:eastAsia="Times New Roman" w:cs="Times New Roman"/>
+          <w:sz w:val="24"/>
+          <w:szCs w:val="24"/>
+        </w:rPr>
+      </w:r>
+    </w:p>
+    <w:p>
+      <w:pPr>
+        <w:pBdr>
+          <w:top w:val="none" w:color="000000" w:sz="4" w:space="0"/>
+          <w:left w:val="none" w:color="000000" w:sz="4" w:space="0"/>
+          <w:bottom w:val="none" w:color="000000" w:sz="4" w:space="0"/>
+          <w:right w:val="none" w:color="000000" w:sz="4" w:space="0"/>
+        </w:pBdr>
+        <w:spacing/>
+        <w:ind w:right="0"/>
+        <w:rPr>
+          <w:rFonts w:ascii="Times New Roman" w:hAnsi="Times New Roman" w:eastAsia="Times New Roman" w:cs="Times New Roman"/>
+          <w:sz w:val="24"/>
+          <w:szCs w:val="24"/>
+        </w:rPr>
+      </w:pPr>
+      <w:r>
+        <w:rPr>
+          <w:rFonts w:ascii="Times New Roman" w:hAnsi="Times New Roman" w:eastAsia="Times New Roman" w:cs="Times New Roman"/>
+          <w:sz w:val="24"/>
+          <w:szCs w:val="24"/>
+        </w:rPr>
+      </w:r>
+      <w:r>
+        <w:rPr>
+          <w:rFonts w:ascii="Times New Roman" w:hAnsi="Times New Roman" w:eastAsia="Times New Roman" w:cs="Times New Roman"/>
+          <w:sz w:val="24"/>
+          <w:szCs w:val="24"/>
+        </w:rPr>
+      </w:r>
+      <w:r>
+        <w:rPr>
+          <w:rFonts w:ascii="Times New Roman" w:hAnsi="Times New Roman" w:eastAsia="Times New Roman" w:cs="Times New Roman"/>
+          <w:sz w:val="24"/>
+          <w:szCs w:val="24"/>
+        </w:rPr>
+      </w:r>
+    </w:p>
+    <w:p>
+      <w:pPr>
+        <w:pBdr>
+          <w:top w:val="none" w:color="000000" w:sz="4" w:space="0"/>
+          <w:left w:val="none" w:color="000000" w:sz="4" w:space="0"/>
+          <w:bottom w:val="none" w:color="000000" w:sz="4" w:space="0"/>
+          <w:right w:val="none" w:color="000000" w:sz="4" w:space="0"/>
+        </w:pBdr>
+        <w:spacing/>
+        <w:ind w:right="0"/>
+        <w:rPr>
+          <w:rFonts w:ascii="Times New Roman" w:hAnsi="Times New Roman" w:eastAsia="Times New Roman" w:cs="Times New Roman"/>
+          <w:sz w:val="24"/>
+          <w:szCs w:val="24"/>
+        </w:rPr>
+      </w:pPr>
+      <w:r>
+        <w:rPr>
+          <w:rFonts w:ascii="Times New Roman" w:hAnsi="Times New Roman" w:eastAsia="Times New Roman" w:cs="Times New Roman"/>
+          <w:sz w:val="24"/>
+          <w:szCs w:val="24"/>
+        </w:rPr>
+      </w:r>
+      <w:r>
+        <w:rPr>
+          <w:rFonts w:ascii="Times New Roman" w:hAnsi="Times New Roman" w:eastAsia="Times New Roman" w:cs="Times New Roman"/>
+          <w:sz w:val="24"/>
+          <w:szCs w:val="24"/>
+        </w:rPr>
+      </w:r>
+      <w:r>
+        <w:rPr>
+          <w:rFonts w:ascii="Times New Roman" w:hAnsi="Times New Roman" w:eastAsia="Times New Roman" w:cs="Times New Roman"/>
+          <w:sz w:val="24"/>
+          <w:szCs w:val="24"/>
+        </w:rPr>
+      </w:r>
+    </w:p>
+    <w:p>
+      <w:pPr>
+        <w:pBdr>
+          <w:top w:val="none" w:color="000000" w:sz="4" w:space="0"/>
+          <w:left w:val="none" w:color="000000" w:sz="4" w:space="0"/>
+          <w:bottom w:val="none" w:color="000000" w:sz="4" w:space="0"/>
+          <w:right w:val="none" w:color="000000" w:sz="4" w:space="0"/>
+        </w:pBdr>
+        <w:spacing/>
+        <w:ind w:right="0"/>
+        <w:rPr>
+          <w:rFonts w:ascii="Times New Roman" w:hAnsi="Times New Roman" w:eastAsia="Times New Roman" w:cs="Times New Roman"/>
+          <w:sz w:val="24"/>
+          <w:szCs w:val="24"/>
+        </w:rPr>
+      </w:pPr>
+      <w:r>
+        <w:rPr>
+          <w:rFonts w:ascii="Times New Roman" w:hAnsi="Times New Roman" w:eastAsia="Times New Roman" w:cs="Times New Roman"/>
+          <w:sz w:val="24"/>
+          <w:szCs w:val="24"/>
+        </w:rPr>
+      </w:r>
+      <w:r>
+        <w:rPr>
+          <w:rFonts w:ascii="Times New Roman" w:hAnsi="Times New Roman" w:eastAsia="Times New Roman" w:cs="Times New Roman"/>
+          <w:sz w:val="24"/>
+          <w:szCs w:val="24"/>
+        </w:rPr>
+      </w:r>
+      <w:r>
+        <w:rPr>
+          <w:rFonts w:ascii="Times New Roman" w:hAnsi="Times New Roman" w:eastAsia="Times New Roman" w:cs="Times New Roman"/>
+          <w:sz w:val="24"/>
+          <w:szCs w:val="24"/>
+        </w:rPr>
+      </w:r>
+    </w:p>
+    <w:p>
+      <w:pPr>
+        <w:pBdr>
+          <w:top w:val="none" w:color="000000" w:sz="4" w:space="0"/>
+          <w:left w:val="none" w:color="000000" w:sz="4" w:space="0"/>
+          <w:bottom w:val="none" w:color="000000" w:sz="4" w:space="0"/>
+          <w:right w:val="none" w:color="000000" w:sz="4" w:space="0"/>
+        </w:pBdr>
+        <w:spacing/>
+        <w:ind w:right="0"/>
+        <w:rPr>
+          <w:rFonts w:ascii="Times New Roman" w:hAnsi="Times New Roman" w:eastAsia="Times New Roman" w:cs="Times New Roman"/>
+          <w:sz w:val="24"/>
+          <w:szCs w:val="24"/>
+        </w:rPr>
+      </w:pPr>
+      <w:r>
+        <w:rPr>
+          <w:rFonts w:ascii="Times New Roman" w:hAnsi="Times New Roman" w:eastAsia="Times New Roman" w:cs="Times New Roman"/>
+          <w:sz w:val="24"/>
+          <w:szCs w:val="24"/>
+        </w:rPr>
+      </w:r>
+      <w:r>
+        <w:rPr>
+          <w:rFonts w:ascii="Times New Roman" w:hAnsi="Times New Roman" w:eastAsia="Times New Roman" w:cs="Times New Roman"/>
+          <w:sz w:val="24"/>
+          <w:szCs w:val="24"/>
+        </w:rPr>
+      </w:r>
+      <w:r>
+        <w:rPr>
+          <w:rFonts w:ascii="Times New Roman" w:hAnsi="Times New Roman" w:eastAsia="Times New Roman" w:cs="Times New Roman"/>
+          <w:sz w:val="24"/>
+          <w:szCs w:val="24"/>
+        </w:rPr>
+      </w:r>
+    </w:p>
+    <w:p>
+      <w:pPr>
+        <w:pBdr>
+          <w:top w:val="none" w:color="000000" w:sz="4" w:space="0"/>
+          <w:left w:val="none" w:color="000000" w:sz="4" w:space="0"/>
+          <w:bottom w:val="none" w:color="000000" w:sz="4" w:space="0"/>
+          <w:right w:val="none" w:color="000000" w:sz="4" w:space="0"/>
+        </w:pBdr>
+        <w:spacing/>
+        <w:ind w:right="0"/>
+        <w:rPr>
+          <w:rFonts w:ascii="Times New Roman" w:hAnsi="Times New Roman" w:eastAsia="Times New Roman" w:cs="Times New Roman"/>
+          <w:sz w:val="24"/>
+          <w:szCs w:val="24"/>
+        </w:rPr>
+      </w:pPr>
+      <w:r>
+        <w:rPr>
+          <w:rFonts w:ascii="Times New Roman" w:hAnsi="Times New Roman" w:eastAsia="Times New Roman" w:cs="Times New Roman"/>
+          <w:sz w:val="24"/>
+          <w:szCs w:val="24"/>
+        </w:rPr>
+      </w:r>
+      <w:r>
+        <w:rPr>
+          <w:rFonts w:ascii="Times New Roman" w:hAnsi="Times New Roman" w:eastAsia="Times New Roman" w:cs="Times New Roman"/>
+          <w:sz w:val="24"/>
+          <w:szCs w:val="24"/>
+        </w:rPr>
+      </w:r>
+      <w:r>
+        <w:rPr>
+          <w:rFonts w:ascii="Times New Roman" w:hAnsi="Times New Roman" w:eastAsia="Times New Roman" w:cs="Times New Roman"/>
+          <w:sz w:val="24"/>
+          <w:szCs w:val="24"/>
+        </w:rPr>
+      </w:r>
+    </w:p>
+    <w:p>
+      <w:pPr>
+        <w:pBdr>
+          <w:top w:val="none" w:color="000000" w:sz="4" w:space="0"/>
+          <w:left w:val="none" w:color="000000" w:sz="4" w:space="0"/>
+          <w:bottom w:val="none" w:color="000000" w:sz="4" w:space="0"/>
+          <w:right w:val="none" w:color="000000" w:sz="4" w:space="0"/>
+        </w:pBdr>
+        <w:spacing/>
+        <w:ind w:right="0"/>
+        <w:rPr>
+          <w:rFonts w:ascii="Times New Roman" w:hAnsi="Times New Roman" w:eastAsia="Times New Roman" w:cs="Times New Roman"/>
+          <w:sz w:val="24"/>
+          <w:szCs w:val="24"/>
+        </w:rPr>
+      </w:pPr>
+      <w:r>
+        <w:rPr>
+          <w:rFonts w:ascii="Times New Roman" w:hAnsi="Times New Roman" w:eastAsia="Times New Roman" w:cs="Times New Roman"/>
+          <w:sz w:val="24"/>
+          <w:szCs w:val="24"/>
+        </w:rPr>
+      </w:r>
+      <w:r>
+        <w:rPr>
+          <w:rFonts w:ascii="Times New Roman" w:hAnsi="Times New Roman" w:eastAsia="Times New Roman" w:cs="Times New Roman"/>
+          <w:sz w:val="24"/>
+          <w:szCs w:val="24"/>
+        </w:rPr>
+      </w:r>
+      <w:r>
+        <w:rPr>
+          <w:rFonts w:ascii="Times New Roman" w:hAnsi="Times New Roman" w:eastAsia="Times New Roman" w:cs="Times New Roman"/>
+          <w:sz w:val="24"/>
+          <w:szCs w:val="24"/>
+        </w:rPr>
+      </w:r>
+    </w:p>
+    <w:p>
+      <w:pPr>
+        <w:pBdr>
+          <w:top w:val="none" w:color="000000" w:sz="4" w:space="0"/>
+          <w:left w:val="none" w:color="000000" w:sz="4" w:space="0"/>
+          <w:bottom w:val="none" w:color="000000" w:sz="4" w:space="0"/>
+          <w:right w:val="none" w:color="000000" w:sz="4" w:space="0"/>
+        </w:pBdr>
+        <w:spacing/>
+        <w:ind w:right="0"/>
+        <w:rPr>
+          <w:rFonts w:ascii="Times New Roman" w:hAnsi="Times New Roman" w:eastAsia="Times New Roman" w:cs="Times New Roman"/>
+          <w:sz w:val="24"/>
+          <w:szCs w:val="24"/>
+        </w:rPr>
+      </w:pPr>
+      <w:r>
+        <w:rPr>
+          <w:rFonts w:ascii="Times New Roman" w:hAnsi="Times New Roman" w:eastAsia="Times New Roman" w:cs="Times New Roman"/>
+          <w:sz w:val="24"/>
+          <w:szCs w:val="24"/>
+        </w:rPr>
+      </w:r>
+      <w:r>
+        <w:rPr>
+          <w:rFonts w:ascii="Times New Roman" w:hAnsi="Times New Roman" w:eastAsia="Times New Roman" w:cs="Times New Roman"/>
+          <w:sz w:val="24"/>
+          <w:szCs w:val="24"/>
+        </w:rPr>
+      </w:r>
+      <w:r>
+        <w:rPr>
+          <w:rFonts w:ascii="Times New Roman" w:hAnsi="Times New Roman" w:eastAsia="Times New Roman" w:cs="Times New Roman"/>
+          <w:sz w:val="24"/>
+          <w:szCs w:val="24"/>
+        </w:rPr>
+      </w:r>
+    </w:p>
+    <w:p>
+      <w:pPr>
+        <w:pBdr>
+          <w:top w:val="none" w:color="000000" w:sz="4" w:space="0"/>
+          <w:left w:val="none" w:color="000000" w:sz="4" w:space="0"/>
+          <w:bottom w:val="none" w:color="000000" w:sz="4" w:space="0"/>
+          <w:right w:val="none" w:color="000000" w:sz="4" w:space="0"/>
+        </w:pBdr>
+        <w:spacing/>
+        <w:ind w:right="0"/>
+        <w:rPr>
+          <w:rFonts w:ascii="Times New Roman" w:hAnsi="Times New Roman" w:eastAsia="Times New Roman" w:cs="Times New Roman"/>
+          <w:sz w:val="24"/>
+          <w:szCs w:val="24"/>
+        </w:rPr>
+      </w:pPr>
+      <w:r>
+        <w:rPr>
+          <w:rFonts w:ascii="Times New Roman" w:hAnsi="Times New Roman" w:eastAsia="Times New Roman" w:cs="Times New Roman"/>
+          <w:sz w:val="24"/>
+          <w:szCs w:val="24"/>
+        </w:rPr>
+      </w:r>
+      <w:r>
+        <w:rPr>
+          <w:rFonts w:ascii="Times New Roman" w:hAnsi="Times New Roman" w:eastAsia="Times New Roman" w:cs="Times New Roman"/>
+          <w:sz w:val="24"/>
+          <w:szCs w:val="24"/>
+        </w:rPr>
+      </w:r>
+      <w:r>
+        <w:rPr>
+          <w:rFonts w:ascii="Times New Roman" w:hAnsi="Times New Roman" w:eastAsia="Times New Roman" w:cs="Times New Roman"/>
+          <w:sz w:val="24"/>
+          <w:szCs w:val="24"/>
+        </w:rPr>
+      </w:r>
+    </w:p>
+    <w:p>
+      <w:pPr>
+        <w:pBdr>
+          <w:top w:val="none" w:color="000000" w:sz="4" w:space="0"/>
+          <w:left w:val="none" w:color="000000" w:sz="4" w:space="0"/>
+          <w:bottom w:val="none" w:color="000000" w:sz="4" w:space="0"/>
+          <w:right w:val="none" w:color="000000" w:sz="4" w:space="0"/>
+        </w:pBdr>
+        <w:spacing/>
+        <w:ind w:right="0"/>
+        <w:rPr>
+          <w:rFonts w:ascii="Times New Roman" w:hAnsi="Times New Roman" w:eastAsia="Times New Roman" w:cs="Times New Roman"/>
+          <w:sz w:val="24"/>
+          <w:szCs w:val="24"/>
+        </w:rPr>
+      </w:pPr>
+      <w:r>
+        <w:rPr>
+          <w:rFonts w:ascii="Times New Roman" w:hAnsi="Times New Roman" w:eastAsia="Times New Roman" w:cs="Times New Roman"/>
+          <w:sz w:val="24"/>
+          <w:szCs w:val="24"/>
+        </w:rPr>
+      </w:r>
+      <w:r>
+        <w:rPr>
+          <w:rFonts w:ascii="Times New Roman" w:hAnsi="Times New Roman" w:eastAsia="Times New Roman" w:cs="Times New Roman"/>
+          <w:sz w:val="24"/>
+          <w:szCs w:val="24"/>
+        </w:rPr>
+      </w:r>
+      <w:r>
+        <w:rPr>
+          <w:rFonts w:ascii="Times New Roman" w:hAnsi="Times New Roman" w:eastAsia="Times New Roman" w:cs="Times New Roman"/>
+          <w:sz w:val="24"/>
+          <w:szCs w:val="24"/>
+        </w:rPr>
+      </w:r>
+    </w:p>
+    <w:p>
+      <w:pPr>
+        <w:pBdr>
+          <w:top w:val="none" w:color="000000" w:sz="4" w:space="0"/>
+          <w:left w:val="none" w:color="000000" w:sz="4" w:space="0"/>
+          <w:bottom w:val="none" w:color="000000" w:sz="4" w:space="0"/>
+          <w:right w:val="none" w:color="000000" w:sz="4" w:space="0"/>
+        </w:pBdr>
+        <w:spacing/>
+        <w:ind w:right="0"/>
+        <w:rPr>
+          <w:rFonts w:ascii="Times New Roman" w:hAnsi="Times New Roman" w:eastAsia="Times New Roman" w:cs="Times New Roman"/>
+          <w:sz w:val="24"/>
+          <w:szCs w:val="24"/>
+        </w:rPr>
+      </w:pPr>
+      <w:r>
+        <w:rPr>
+          <w:rFonts w:ascii="Times New Roman" w:hAnsi="Times New Roman" w:eastAsia="Times New Roman" w:cs="Times New Roman"/>
+          <w:color w:val="000000"/>
+          <w:sz w:val="24"/>
+          <w:highlight w:val="none"/>
+        </w:rPr>
+      </w:r>
+      <w:r>
+        <w:rPr>
+          <w:rFonts w:ascii="Times New Roman" w:hAnsi="Times New Roman" w:eastAsia="Times New Roman" w:cs="Times New Roman"/>
+          <w:color w:val="000000"/>
+          <w:sz w:val="24"/>
+          <w:highlight w:val="none"/>
+        </w:rPr>
+      </w:r>
+      <w:r>
+        <w:rPr>
+          <w:rFonts w:ascii="Times New Roman" w:hAnsi="Times New Roman" w:eastAsia="Times New Roman" w:cs="Times New Roman"/>
+          <w:color w:val="000000"/>
+          <w:sz w:val="24"/>
+          <w:highlight w:val="none"/>
+        </w:rPr>
+      </w:r>
+    </w:p>
+    <w:p>
+      <w:pPr>
+        <w:pBdr>
+          <w:top w:val="none" w:color="000000" w:sz="4" w:space="0"/>
+          <w:left w:val="none" w:color="000000" w:sz="4" w:space="0"/>
+          <w:bottom w:val="none" w:color="000000" w:sz="4" w:space="0"/>
+          <w:right w:val="none" w:color="000000" w:sz="4" w:space="0"/>
+        </w:pBdr>
+        <w:spacing/>
+        <w:ind w:right="0" w:firstLine="0" w:left="709"/>
+        <w:rPr>
+          <w:rFonts w:ascii="Times New Roman" w:hAnsi="Times New Roman" w:eastAsia="Times New Roman" w:cs="Times New Roman"/>
+          <w:sz w:val="24"/>
+          <w:szCs w:val="24"/>
+        </w:rPr>
+      </w:pPr>
+      <w:r>
+        <w:rPr>
+          <w:highlight w:val="none"/>
+        </w:rPr>
+      </w:r>
+      <w:r>
+        <w:rPr>
+          <w:highlight w:val="none"/>
+        </w:rPr>
+      </w:r>
+      <w:r>
+        <w:rPr>
+          <w:highlight w:val="none"/>
+        </w:rPr>
+      </w:r>
+      <w:r>
+        <w:rPr>
+          <w:highlight w:val="none"/>
+        </w:rPr>
+      </w:r>
+      <w:r>
+        <w:rPr>
+          <w:highlight w:val="none"/>
+        </w:rPr>
+      </w:r>
+      <w:r>
+        <w:rPr>
+          <w:highlight w:val="none"/>
+        </w:rPr>
+      </w:r>
+      <w:r>
+        <w:rPr>
+          <w:highlight w:val="none"/>
+        </w:rPr>
+      </w:r>
+    </w:p>
+    <w:p>
+      <w:pPr>
+        <w:pBdr/>
+        <w:spacing/>
+        <w:ind/>
+        <w:jc w:val="center"/>
+        <w:rPr>
+          <w:b/>
+          <w:bCs/>
+          <w:i/>
+          <w:highlight w:val="none"/>
+          <w:u w:val="single"/>
         </w:rPr>
       </w:pPr>
       <w:r>
@@ -1693,6 +2959,7 @@
           <w:highlight w:val="none"/>
           <w:u w:val="single"/>
         </w:rPr>
+        <w:t xml:space="preserve">6. Modelo de datos</w:t>
       </w:r>
       <w:r>
         <w:rPr>
@@ -1700,6 +2967,1278 @@
           <w:bCs w:val="0"/>
           <w:i w:val="0"/>
           <w:u w:val="none"/>
+        </w:rPr>
+      </w:r>
+    </w:p>
+    <w:p>
+      <w:pPr>
+        <w:pBdr>
+          <w:top w:val="none" w:color="000000" w:sz="4" w:space="0"/>
+          <w:left w:val="none" w:color="000000" w:sz="4" w:space="0"/>
+          <w:bottom w:val="none" w:color="000000" w:sz="4" w:space="0"/>
+          <w:right w:val="none" w:color="000000" w:sz="4" w:space="0"/>
+        </w:pBdr>
+        <w:spacing/>
+        <w:ind w:right="0" w:firstLine="0" w:left="0"/>
+        <w:rPr/>
+      </w:pPr>
+      <w:r>
+        <w:t xml:space="preserve">La base de datos relacional modela el entorno de la escuela con las siguientes tablas principales:</w:t>
+      </w:r>
+      <w:r/>
+    </w:p>
+    <w:p>
+      <w:pPr>
+        <w:pStyle w:val="891"/>
+        <w:numPr>
+          <w:ilvl w:val="0"/>
+          <w:numId w:val="8"/>
+        </w:numPr>
+        <w:pBdr>
+          <w:top w:val="none" w:color="000000" w:sz="4" w:space="0"/>
+          <w:left w:val="none" w:color="000000" w:sz="4" w:space="0"/>
+          <w:bottom w:val="none" w:color="000000" w:sz="4" w:space="0"/>
+          <w:right w:val="none" w:color="000000" w:sz="4" w:space="0"/>
+        </w:pBdr>
+        <w:spacing/>
+        <w:ind w:right="0"/>
+        <w:rPr/>
+      </w:pPr>
+      <w:r>
+        <w:t xml:space="preserve">Usuarios / Roles: Entidad central de autenticación y control de acceso.</w:t>
+      </w:r>
+      <w:r/>
+    </w:p>
+    <w:p>
+      <w:pPr>
+        <w:pStyle w:val="891"/>
+        <w:numPr>
+          <w:ilvl w:val="0"/>
+          <w:numId w:val="8"/>
+        </w:numPr>
+        <w:pBdr>
+          <w:top w:val="none" w:color="000000" w:sz="4" w:space="0"/>
+          <w:left w:val="none" w:color="000000" w:sz="4" w:space="0"/>
+          <w:bottom w:val="none" w:color="000000" w:sz="4" w:space="0"/>
+          <w:right w:val="none" w:color="000000" w:sz="4" w:space="0"/>
+        </w:pBdr>
+        <w:spacing/>
+        <w:ind w:right="0"/>
+        <w:rPr/>
+      </w:pPr>
+      <w:r>
+        <w:t xml:space="preserve">Alumnos / Profesores / Administradores / Padres: Tablas con relación uno a uno (1:1) hacia Usuarios para especializar los perfiles.</w:t>
+      </w:r>
+      <w:r/>
+    </w:p>
+    <w:p>
+      <w:pPr>
+        <w:pStyle w:val="891"/>
+        <w:numPr>
+          <w:ilvl w:val="0"/>
+          <w:numId w:val="8"/>
+        </w:numPr>
+        <w:pBdr>
+          <w:top w:val="none" w:color="000000" w:sz="4" w:space="0"/>
+          <w:left w:val="none" w:color="000000" w:sz="4" w:space="0"/>
+          <w:bottom w:val="none" w:color="000000" w:sz="4" w:space="0"/>
+          <w:right w:val="none" w:color="000000" w:sz="4" w:space="0"/>
+        </w:pBdr>
+        <w:spacing/>
+        <w:ind w:right="0"/>
+        <w:rPr/>
+      </w:pPr>
+      <w:r>
+        <w:t xml:space="preserve">Asignaturas / Grupos: Relación uno a muchos (1:N) donde un Grupo pertenece a una Asignatura y es impartido por un Profesor.</w:t>
+      </w:r>
+      <w:r/>
+    </w:p>
+    <w:p>
+      <w:pPr>
+        <w:pStyle w:val="891"/>
+        <w:numPr>
+          <w:ilvl w:val="0"/>
+          <w:numId w:val="8"/>
+        </w:numPr>
+        <w:pBdr>
+          <w:top w:val="none" w:color="000000" w:sz="4" w:space="0"/>
+          <w:left w:val="none" w:color="000000" w:sz="4" w:space="0"/>
+          <w:bottom w:val="none" w:color="000000" w:sz="4" w:space="0"/>
+          <w:right w:val="none" w:color="000000" w:sz="4" w:space="0"/>
+        </w:pBdr>
+        <w:spacing/>
+        <w:ind w:right="0"/>
+        <w:rPr/>
+      </w:pPr>
+      <w:r>
+        <w:t xml:space="preserve">Inscripciones / Asistencias: Tablas pivote transaccionales que relacionan Alumnos con Grupos, almacenando la calificación y la fecha de la toma de asistencia respectivamente.</w:t>
+      </w:r>
+      <w:r/>
+    </w:p>
+    <w:p>
+      <w:pPr>
+        <w:pBdr/>
+        <w:spacing/>
+        <w:ind/>
+        <w:jc w:val="both"/>
+        <w:rPr>
+          <w:b/>
+          <w:bCs/>
+          <w:i/>
+          <w:highlight w:val="none"/>
+          <w:u w:val="single"/>
+        </w:rPr>
+      </w:pPr>
+      <w:r>
+        <w:rPr>
+          <w:b/>
+          <w:bCs/>
+          <w:i/>
+          <w:iCs/>
+          <w:highlight w:val="none"/>
+          <w:u w:val="single"/>
+        </w:rPr>
+        <w:t xml:space="preserve">A</w:t>
+      </w:r>
+      <w:r>
+        <w:rPr>
+          <w:b/>
+          <w:bCs/>
+          <w:i/>
+          <w:iCs/>
+          <w:highlight w:val="none"/>
+          <w:u w:val="single"/>
+        </w:rPr>
+        <w:t xml:space="preserve">ÚN FALTA</w:t>
+      </w:r>
+      <w:r>
+        <w:rPr>
+          <w:b w:val="0"/>
+          <w:bCs w:val="0"/>
+          <w:i w:val="0"/>
+          <w:u w:val="none"/>
+        </w:rPr>
+      </w:r>
+    </w:p>
+    <w:p>
+      <w:pPr>
+        <w:pStyle w:val="704"/>
+        <w:pBdr>
+          <w:top w:val="none" w:color="000000" w:sz="4" w:space="0"/>
+          <w:left w:val="none" w:color="000000" w:sz="4" w:space="0"/>
+          <w:bottom w:val="none" w:color="000000" w:sz="4" w:space="0"/>
+          <w:right w:val="none" w:color="000000" w:sz="4" w:space="0"/>
+        </w:pBdr>
+        <w:spacing/>
+        <w:ind w:right="0" w:firstLine="0" w:left="0"/>
+        <w:rPr/>
+      </w:pPr>
+      <w:r>
+        <w:rPr>
+          <w:rFonts w:ascii="Times New Roman" w:hAnsi="Times New Roman" w:eastAsia="Times New Roman" w:cs="Times New Roman"/>
+          <w:b/>
+          <w:color w:val="000000"/>
+          <w:sz w:val="36"/>
+        </w:rPr>
+        <w:t xml:space="preserve">7. Diseño del Sistema</w:t>
+      </w:r>
+      <w:r/>
+    </w:p>
+    <w:p>
+      <w:pPr>
+        <w:pStyle w:val="891"/>
+        <w:numPr>
+          <w:ilvl w:val="0"/>
+          <w:numId w:val="9"/>
+        </w:numPr>
+        <w:pBdr>
+          <w:top w:val="none" w:color="000000" w:sz="4" w:space="0"/>
+          <w:left w:val="none" w:color="000000" w:sz="4" w:space="0"/>
+          <w:bottom w:val="none" w:color="000000" w:sz="4" w:space="0"/>
+          <w:right w:val="none" w:color="000000" w:sz="4" w:space="0"/>
+        </w:pBdr>
+        <w:spacing/>
+        <w:ind w:right="0"/>
+        <w:rPr/>
+      </w:pPr>
+      <w:r>
+        <w:rPr>
+          <w:rFonts w:ascii="Times New Roman" w:hAnsi="Times New Roman" w:eastAsia="Times New Roman" w:cs="Times New Roman"/>
+          <w:b/>
+          <w:color w:val="000000"/>
+          <w:sz w:val="24"/>
+        </w:rPr>
+        <w:t xml:space="preserve">7.2 DTOs y 7.3 Validaciones:</w:t>
+      </w:r>
+      <w:r>
+        <w:rPr>
+          <w:rFonts w:ascii="Times New Roman" w:hAnsi="Times New Roman" w:eastAsia="Times New Roman" w:cs="Times New Roman"/>
+          <w:color w:val="000000"/>
+          <w:sz w:val="24"/>
+        </w:rPr>
+        <w:t xml:space="preserve"> El sistema utiliza clases como </w:t>
+      </w:r>
+      <w:r>
+        <w:rPr>
+          <w:rFonts w:ascii="Courier New" w:hAnsi="Courier New" w:eastAsia="Courier New" w:cs="Courier New"/>
+          <w:color w:val="000000"/>
+          <w:sz w:val="20"/>
+        </w:rPr>
+        <w:t xml:space="preserve">UsuariosDTO</w:t>
+      </w:r>
+      <w:r>
+        <w:rPr>
+          <w:rFonts w:ascii="Times New Roman" w:hAnsi="Times New Roman" w:eastAsia="Times New Roman" w:cs="Times New Roman"/>
+          <w:color w:val="000000"/>
+          <w:sz w:val="24"/>
+        </w:rPr>
+        <w:t xml:space="preserve">, </w:t>
+      </w:r>
+      <w:r>
+        <w:rPr>
+          <w:rFonts w:ascii="Courier New" w:hAnsi="Courier New" w:eastAsia="Courier New" w:cs="Courier New"/>
+          <w:color w:val="000000"/>
+          <w:sz w:val="20"/>
+        </w:rPr>
+        <w:t xml:space="preserve">GruposDTO</w:t>
+      </w:r>
+      <w:r>
+        <w:rPr>
+          <w:rFonts w:ascii="Times New Roman" w:hAnsi="Times New Roman" w:eastAsia="Times New Roman" w:cs="Times New Roman"/>
+          <w:color w:val="000000"/>
+          <w:sz w:val="24"/>
+        </w:rPr>
+        <w:t xml:space="preserve"> o </w:t>
+      </w:r>
+      <w:r>
+        <w:rPr>
+          <w:rFonts w:ascii="Courier New" w:hAnsi="Courier New" w:eastAsia="Courier New" w:cs="Courier New"/>
+          <w:color w:val="000000"/>
+          <w:sz w:val="20"/>
+        </w:rPr>
+        <w:t xml:space="preserve">InscripcionesDTO</w:t>
+      </w:r>
+      <w:r>
+        <w:rPr>
+          <w:rFonts w:ascii="Times New Roman" w:hAnsi="Times New Roman" w:eastAsia="Times New Roman" w:cs="Times New Roman"/>
+          <w:color w:val="000000"/>
+          <w:sz w:val="24"/>
+        </w:rPr>
+        <w:t xml:space="preserve"> que actúan como puente entre las peticiones HTTP y los Servicios. Estos implementan validaciones para asegurar que no se creen registros huérfanos (ej. </w:t>
+      </w:r>
+      <w:r>
+        <w:rPr>
+          <w:rFonts w:ascii="Courier New" w:hAnsi="Courier New" w:eastAsia="Courier New" w:cs="Courier New"/>
+          <w:color w:val="000000"/>
+          <w:sz w:val="20"/>
+        </w:rPr>
+        <w:t xml:space="preserve">@NotNull(message = "Debe asignar un profesor")</w:t>
+      </w:r>
+      <w:r>
+        <w:rPr>
+          <w:rFonts w:ascii="Times New Roman" w:hAnsi="Times New Roman" w:eastAsia="Times New Roman" w:cs="Times New Roman"/>
+          <w:color w:val="000000"/>
+          <w:sz w:val="24"/>
+        </w:rPr>
+        <w:t xml:space="preserve">).</w:t>
+      </w:r>
+      <w:r/>
+    </w:p>
+    <w:p>
+      <w:pPr>
+        <w:pStyle w:val="891"/>
+        <w:numPr>
+          <w:ilvl w:val="0"/>
+          <w:numId w:val="9"/>
+        </w:numPr>
+        <w:pBdr>
+          <w:top w:val="none" w:color="000000" w:sz="4" w:space="0"/>
+          <w:left w:val="none" w:color="000000" w:sz="4" w:space="0"/>
+          <w:bottom w:val="none" w:color="000000" w:sz="4" w:space="0"/>
+          <w:right w:val="none" w:color="000000" w:sz="4" w:space="0"/>
+        </w:pBdr>
+        <w:spacing/>
+        <w:ind w:right="0"/>
+        <w:rPr/>
+      </w:pPr>
+      <w:r>
+        <w:rPr>
+          <w:rFonts w:ascii="Times New Roman" w:hAnsi="Times New Roman" w:eastAsia="Times New Roman" w:cs="Times New Roman"/>
+          <w:b/>
+          <w:color w:val="000000"/>
+          <w:sz w:val="24"/>
+        </w:rPr>
+        <w:t xml:space="preserve">7.4 Servicios:</w:t>
+      </w:r>
+      <w:r>
+        <w:rPr>
+          <w:rFonts w:ascii="Times New Roman" w:hAnsi="Times New Roman" w:eastAsia="Times New Roman" w:cs="Times New Roman"/>
+          <w:color w:val="000000"/>
+          <w:sz w:val="24"/>
+        </w:rPr>
+        <w:t xml:space="preserve"> Patrón Fachada implementado. Ejemplo: </w:t>
+      </w:r>
+      <w:r>
+        <w:rPr>
+          <w:rFonts w:ascii="Courier New" w:hAnsi="Courier New" w:eastAsia="Courier New" w:cs="Courier New"/>
+          <w:color w:val="000000"/>
+          <w:sz w:val="20"/>
+        </w:rPr>
+        <w:t xml:space="preserve">GrupoServiceImpl</w:t>
+      </w:r>
+      <w:r>
+        <w:rPr>
+          <w:rFonts w:ascii="Times New Roman" w:hAnsi="Times New Roman" w:eastAsia="Times New Roman" w:cs="Times New Roman"/>
+          <w:color w:val="000000"/>
+          <w:sz w:val="24"/>
+        </w:rPr>
+        <w:t xml:space="preserve"> coordina la inyección de </w:t>
+      </w:r>
+      <w:r>
+        <w:rPr>
+          <w:rFonts w:ascii="Courier New" w:hAnsi="Courier New" w:eastAsia="Courier New" w:cs="Courier New"/>
+          <w:color w:val="000000"/>
+          <w:sz w:val="20"/>
+        </w:rPr>
+        <w:t xml:space="preserve">AsignaturaRepository</w:t>
+      </w:r>
+      <w:r>
+        <w:rPr>
+          <w:rFonts w:ascii="Times New Roman" w:hAnsi="Times New Roman" w:eastAsia="Times New Roman" w:cs="Times New Roman"/>
+          <w:color w:val="000000"/>
+          <w:sz w:val="24"/>
+        </w:rPr>
+        <w:t xml:space="preserve"> y </w:t>
+      </w:r>
+      <w:r>
+        <w:rPr>
+          <w:rFonts w:ascii="Courier New" w:hAnsi="Courier New" w:eastAsia="Courier New" w:cs="Courier New"/>
+          <w:color w:val="000000"/>
+          <w:sz w:val="20"/>
+        </w:rPr>
+        <w:t xml:space="preserve">ProfesorRepository</w:t>
+      </w:r>
+      <w:r>
+        <w:rPr>
+          <w:rFonts w:ascii="Times New Roman" w:hAnsi="Times New Roman" w:eastAsia="Times New Roman" w:cs="Times New Roman"/>
+          <w:color w:val="000000"/>
+          <w:sz w:val="24"/>
+        </w:rPr>
+        <w:t xml:space="preserve"> para ensamblar el objeto completo antes de guardarlo.</w:t>
+      </w:r>
+      <w:r/>
+    </w:p>
+    <w:p>
+      <w:pPr>
+        <w:pStyle w:val="704"/>
+        <w:pBdr>
+          <w:top w:val="none" w:color="000000" w:sz="4" w:space="0"/>
+          <w:left w:val="none" w:color="000000" w:sz="4" w:space="0"/>
+          <w:bottom w:val="none" w:color="000000" w:sz="4" w:space="0"/>
+          <w:right w:val="none" w:color="000000" w:sz="4" w:space="0"/>
+        </w:pBdr>
+        <w:spacing/>
+        <w:ind w:right="0" w:firstLine="0" w:left="0"/>
+        <w:rPr/>
+      </w:pPr>
+      <w:r>
+        <w:rPr>
+          <w:rFonts w:ascii="Times New Roman" w:hAnsi="Times New Roman" w:eastAsia="Times New Roman" w:cs="Times New Roman"/>
+          <w:b/>
+          <w:color w:val="000000"/>
+          <w:sz w:val="36"/>
+        </w:rPr>
+        <w:t xml:space="preserve">8. Seguridad</w:t>
+      </w:r>
+      <w:r/>
+    </w:p>
+    <w:p>
+      <w:pPr>
+        <w:pStyle w:val="891"/>
+        <w:numPr>
+          <w:ilvl w:val="0"/>
+          <w:numId w:val="10"/>
+        </w:numPr>
+        <w:pBdr>
+          <w:top w:val="none" w:color="000000" w:sz="4" w:space="0"/>
+          <w:left w:val="none" w:color="000000" w:sz="4" w:space="0"/>
+          <w:bottom w:val="none" w:color="000000" w:sz="4" w:space="0"/>
+          <w:right w:val="none" w:color="000000" w:sz="4" w:space="0"/>
+        </w:pBdr>
+        <w:spacing/>
+        <w:ind w:right="0"/>
+        <w:rPr/>
+      </w:pPr>
+      <w:r>
+        <w:rPr>
+          <w:rFonts w:ascii="Times New Roman" w:hAnsi="Times New Roman" w:eastAsia="Times New Roman" w:cs="Times New Roman"/>
+          <w:b/>
+          <w:color w:val="000000"/>
+          <w:sz w:val="24"/>
+        </w:rPr>
+        <w:t xml:space="preserve">8.1 Configuración de Spring Security:</w:t>
+      </w:r>
+      <w:r>
+        <w:rPr>
+          <w:rFonts w:ascii="Times New Roman" w:hAnsi="Times New Roman" w:eastAsia="Times New Roman" w:cs="Times New Roman"/>
+          <w:color w:val="000000"/>
+          <w:sz w:val="24"/>
+        </w:rPr>
+        <w:t xml:space="preserve"> Se deshabilitó la protección CSRF al tratarse de una API mixta y se estableció el </w:t>
+      </w:r>
+      <w:r>
+        <w:rPr>
+          <w:rFonts w:ascii="Courier New" w:hAnsi="Courier New" w:eastAsia="Courier New" w:cs="Courier New"/>
+          <w:color w:val="000000"/>
+          <w:sz w:val="20"/>
+        </w:rPr>
+        <w:t xml:space="preserve">SessionCreationPolicy.STATELESS</w:t>
+      </w:r>
+      <w:r>
+        <w:rPr>
+          <w:rFonts w:ascii="Times New Roman" w:hAnsi="Times New Roman" w:eastAsia="Times New Roman" w:cs="Times New Roman"/>
+          <w:color w:val="000000"/>
+          <w:sz w:val="24"/>
+        </w:rPr>
+        <w:t xml:space="preserve"> para evitar el guardado de sesiones en la memoria del servidor (Tomcat).</w:t>
+      </w:r>
+      <w:r/>
+    </w:p>
+    <w:p>
+      <w:pPr>
+        <w:pStyle w:val="891"/>
+        <w:numPr>
+          <w:ilvl w:val="0"/>
+          <w:numId w:val="10"/>
+        </w:numPr>
+        <w:pBdr>
+          <w:top w:val="none" w:color="000000" w:sz="4" w:space="0"/>
+          <w:left w:val="none" w:color="000000" w:sz="4" w:space="0"/>
+          <w:bottom w:val="none" w:color="000000" w:sz="4" w:space="0"/>
+          <w:right w:val="none" w:color="000000" w:sz="4" w:space="0"/>
+        </w:pBdr>
+        <w:spacing/>
+        <w:ind w:right="0"/>
+        <w:rPr/>
+      </w:pPr>
+      <w:r>
+        <w:rPr>
+          <w:rFonts w:ascii="Times New Roman" w:hAnsi="Times New Roman" w:eastAsia="Times New Roman" w:cs="Times New Roman"/>
+          <w:b/>
+          <w:color w:val="000000"/>
+          <w:sz w:val="24"/>
+        </w:rPr>
+        <w:t xml:space="preserve">8.2 Filtros personalizados:</w:t>
+      </w:r>
+      <w:r>
+        <w:rPr>
+          <w:rFonts w:ascii="Times New Roman" w:hAnsi="Times New Roman" w:eastAsia="Times New Roman" w:cs="Times New Roman"/>
+          <w:color w:val="000000"/>
+          <w:sz w:val="24"/>
+        </w:rPr>
+        <w:t xml:space="preserve"> Creación de la clase </w:t>
+      </w:r>
+      <w:r>
+        <w:rPr>
+          <w:rFonts w:ascii="Courier New" w:hAnsi="Courier New" w:eastAsia="Courier New" w:cs="Courier New"/>
+          <w:color w:val="000000"/>
+          <w:sz w:val="20"/>
+        </w:rPr>
+        <w:t xml:space="preserve">JwtAuthenticationFilter</w:t>
+      </w:r>
+      <w:r>
+        <w:rPr>
+          <w:rFonts w:ascii="Times New Roman" w:hAnsi="Times New Roman" w:eastAsia="Times New Roman" w:cs="Times New Roman"/>
+          <w:color w:val="000000"/>
+          <w:sz w:val="24"/>
+        </w:rPr>
+        <w:t xml:space="preserve"> que intercepta </w:t>
+      </w:r>
+      <w:r>
+        <w:rPr>
+          <w:rFonts w:ascii="Courier New" w:hAnsi="Courier New" w:eastAsia="Courier New" w:cs="Courier New"/>
+          <w:color w:val="000000"/>
+          <w:sz w:val="20"/>
+        </w:rPr>
+        <w:t xml:space="preserve">OncePerRequestFilter</w:t>
+      </w:r>
+      <w:r>
+        <w:rPr>
+          <w:rFonts w:ascii="Times New Roman" w:hAnsi="Times New Roman" w:eastAsia="Times New Roman" w:cs="Times New Roman"/>
+          <w:color w:val="000000"/>
+          <w:sz w:val="24"/>
+        </w:rPr>
+        <w:t xml:space="preserve">. Su objetivo es inspeccionar el objeto </w:t>
+      </w:r>
+      <w:r>
+        <w:rPr>
+          <w:rFonts w:ascii="Courier New" w:hAnsi="Courier New" w:eastAsia="Courier New" w:cs="Courier New"/>
+          <w:color w:val="000000"/>
+          <w:sz w:val="20"/>
+        </w:rPr>
+        <w:t xml:space="preserve">HttpServletRequest</w:t>
+      </w:r>
+      <w:r>
+        <w:rPr>
+          <w:rFonts w:ascii="Times New Roman" w:hAnsi="Times New Roman" w:eastAsia="Times New Roman" w:cs="Times New Roman"/>
+          <w:color w:val="000000"/>
+          <w:sz w:val="24"/>
+        </w:rPr>
+        <w:t xml:space="preserve">, leer el arreglo de </w:t>
+      </w:r>
+      <w:r>
+        <w:rPr>
+          <w:rFonts w:ascii="Times New Roman" w:hAnsi="Times New Roman" w:eastAsia="Times New Roman" w:cs="Times New Roman"/>
+          <w:i/>
+          <w:color w:val="000000"/>
+          <w:sz w:val="24"/>
+        </w:rPr>
+        <w:t xml:space="preserve">Cookies</w:t>
+      </w:r>
+      <w:r>
+        <w:rPr>
+          <w:rFonts w:ascii="Times New Roman" w:hAnsi="Times New Roman" w:eastAsia="Times New Roman" w:cs="Times New Roman"/>
+          <w:color w:val="000000"/>
+          <w:sz w:val="24"/>
+        </w:rPr>
+        <w:t xml:space="preserve"> y buscar el </w:t>
+      </w:r>
+      <w:r>
+        <w:rPr>
+          <w:rFonts w:ascii="Courier New" w:hAnsi="Courier New" w:eastAsia="Courier New" w:cs="Courier New"/>
+          <w:color w:val="000000"/>
+          <w:sz w:val="20"/>
+        </w:rPr>
+        <w:t xml:space="preserve">accessToken</w:t>
+      </w:r>
+      <w:r>
+        <w:rPr>
+          <w:rFonts w:ascii="Times New Roman" w:hAnsi="Times New Roman" w:eastAsia="Times New Roman" w:cs="Times New Roman"/>
+          <w:color w:val="000000"/>
+          <w:sz w:val="24"/>
+        </w:rPr>
+        <w:t xml:space="preserve">.</w:t>
+      </w:r>
+      <w:r/>
+    </w:p>
+    <w:p>
+      <w:pPr>
+        <w:pStyle w:val="891"/>
+        <w:numPr>
+          <w:ilvl w:val="0"/>
+          <w:numId w:val="10"/>
+        </w:numPr>
+        <w:pBdr>
+          <w:top w:val="none" w:color="000000" w:sz="4" w:space="0"/>
+          <w:left w:val="none" w:color="000000" w:sz="4" w:space="0"/>
+          <w:bottom w:val="none" w:color="000000" w:sz="4" w:space="0"/>
+          <w:right w:val="none" w:color="000000" w:sz="4" w:space="0"/>
+        </w:pBdr>
+        <w:spacing/>
+        <w:ind w:right="0"/>
+        <w:rPr/>
+      </w:pPr>
+      <w:r>
+        <w:rPr>
+          <w:rFonts w:ascii="Times New Roman" w:hAnsi="Times New Roman" w:eastAsia="Times New Roman" w:cs="Times New Roman"/>
+          <w:b/>
+          <w:color w:val="000000"/>
+          <w:sz w:val="24"/>
+        </w:rPr>
+        <w:t xml:space="preserve">8.3 JWT y Refresh Token:</w:t>
+      </w:r>
+      <w:r>
+        <w:rPr>
+          <w:rFonts w:ascii="Times New Roman" w:hAnsi="Times New Roman" w:eastAsia="Times New Roman" w:cs="Times New Roman"/>
+          <w:color w:val="000000"/>
+          <w:sz w:val="24"/>
+        </w:rPr>
+        <w:t xml:space="preserve"> Se utiliza la librería JJWT (0.11.5). El Access Token delega la identidad y los roles del usuario para cada petición en Thymeleaf. El Refresh Token permite renovar el acceso sin forzar un nuevo inicio de sesión manual cuando el token principal caduca.</w:t>
+      </w:r>
+      <w:r/>
+    </w:p>
+    <w:p>
+      <w:pPr>
+        <w:pStyle w:val="704"/>
+        <w:pBdr>
+          <w:top w:val="none" w:color="000000" w:sz="4" w:space="0"/>
+          <w:left w:val="none" w:color="000000" w:sz="4" w:space="0"/>
+          <w:bottom w:val="none" w:color="000000" w:sz="4" w:space="0"/>
+          <w:right w:val="none" w:color="000000" w:sz="4" w:space="0"/>
+        </w:pBdr>
+        <w:spacing/>
+        <w:ind w:right="0" w:firstLine="0" w:left="0"/>
+        <w:rPr/>
+      </w:pPr>
+      <w:r>
+        <w:rPr>
+          <w:rFonts w:ascii="Times New Roman" w:hAnsi="Times New Roman" w:eastAsia="Times New Roman" w:cs="Times New Roman"/>
+          <w:b/>
+          <w:color w:val="000000"/>
+          <w:sz w:val="36"/>
+        </w:rPr>
+        <w:t xml:space="preserve">9. API REST</w:t>
+      </w:r>
+      <w:r/>
+    </w:p>
+    <w:p>
+      <w:pPr>
+        <w:pStyle w:val="891"/>
+        <w:numPr>
+          <w:ilvl w:val="0"/>
+          <w:numId w:val="11"/>
+        </w:numPr>
+        <w:pBdr>
+          <w:top w:val="none" w:color="000000" w:sz="4" w:space="0"/>
+          <w:left w:val="none" w:color="000000" w:sz="4" w:space="0"/>
+          <w:bottom w:val="none" w:color="000000" w:sz="4" w:space="0"/>
+          <w:right w:val="none" w:color="000000" w:sz="4" w:space="0"/>
+        </w:pBdr>
+        <w:spacing/>
+        <w:ind w:right="0"/>
+        <w:rPr/>
+      </w:pPr>
+      <w:r>
+        <w:rPr>
+          <w:rFonts w:ascii="Times New Roman" w:hAnsi="Times New Roman" w:eastAsia="Times New Roman" w:cs="Times New Roman"/>
+          <w:b/>
+          <w:color w:val="000000"/>
+          <w:sz w:val="24"/>
+        </w:rPr>
+        <w:t xml:space="preserve">9.1 Documentación de Endpoints:</w:t>
+      </w:r>
+      <w:r>
+        <w:rPr>
+          <w:rFonts w:ascii="Times New Roman" w:hAnsi="Times New Roman" w:eastAsia="Times New Roman" w:cs="Times New Roman"/>
+          <w:color w:val="000000"/>
+          <w:sz w:val="24"/>
+        </w:rPr>
+        <w:t xml:space="preserve"> Se exponen Endpoints puros en la ruta </w:t>
+      </w:r>
+      <w:r>
+        <w:rPr>
+          <w:rFonts w:ascii="Courier New" w:hAnsi="Courier New" w:eastAsia="Courier New" w:cs="Courier New"/>
+          <w:color w:val="000000"/>
+          <w:sz w:val="20"/>
+        </w:rPr>
+        <w:t xml:space="preserve">/api/v1/*</w:t>
+      </w:r>
+      <w:r>
+        <w:rPr>
+          <w:rFonts w:ascii="Times New Roman" w:hAnsi="Times New Roman" w:eastAsia="Times New Roman" w:cs="Times New Roman"/>
+          <w:color w:val="000000"/>
+          <w:sz w:val="24"/>
+        </w:rPr>
+        <w:t xml:space="preserve"> (</w:t>
+      </w:r>
+      <w:r>
+        <w:rPr>
+          <w:rFonts w:ascii="Courier New" w:hAnsi="Courier New" w:eastAsia="Courier New" w:cs="Courier New"/>
+          <w:color w:val="000000"/>
+          <w:sz w:val="20"/>
+        </w:rPr>
+        <w:t xml:space="preserve">/usuarios</w:t>
+      </w:r>
+      <w:r>
+        <w:rPr>
+          <w:rFonts w:ascii="Times New Roman" w:hAnsi="Times New Roman" w:eastAsia="Times New Roman" w:cs="Times New Roman"/>
+          <w:color w:val="000000"/>
+          <w:sz w:val="24"/>
+        </w:rPr>
+        <w:t xml:space="preserve">, </w:t>
+      </w:r>
+      <w:r>
+        <w:rPr>
+          <w:rFonts w:ascii="Courier New" w:hAnsi="Courier New" w:eastAsia="Courier New" w:cs="Courier New"/>
+          <w:color w:val="000000"/>
+          <w:sz w:val="20"/>
+        </w:rPr>
+        <w:t xml:space="preserve">/asignaturas</w:t>
+      </w:r>
+      <w:r>
+        <w:rPr>
+          <w:rFonts w:ascii="Times New Roman" w:hAnsi="Times New Roman" w:eastAsia="Times New Roman" w:cs="Times New Roman"/>
+          <w:color w:val="000000"/>
+          <w:sz w:val="24"/>
+        </w:rPr>
+        <w:t xml:space="preserve">, </w:t>
+      </w:r>
+      <w:r>
+        <w:rPr>
+          <w:rFonts w:ascii="Courier New" w:hAnsi="Courier New" w:eastAsia="Courier New" w:cs="Courier New"/>
+          <w:color w:val="000000"/>
+          <w:sz w:val="20"/>
+        </w:rPr>
+        <w:t xml:space="preserve">/grupos</w:t>
+      </w:r>
+      <w:r>
+        <w:rPr>
+          <w:rFonts w:ascii="Times New Roman" w:hAnsi="Times New Roman" w:eastAsia="Times New Roman" w:cs="Times New Roman"/>
+          <w:color w:val="000000"/>
+          <w:sz w:val="24"/>
+        </w:rPr>
+        <w:t xml:space="preserve">, </w:t>
+      </w:r>
+      <w:r>
+        <w:rPr>
+          <w:rFonts w:ascii="Courier New" w:hAnsi="Courier New" w:eastAsia="Courier New" w:cs="Courier New"/>
+          <w:color w:val="000000"/>
+          <w:sz w:val="20"/>
+        </w:rPr>
+        <w:t xml:space="preserve">/inscripciones</w:t>
+      </w:r>
+      <w:r>
+        <w:rPr>
+          <w:rFonts w:ascii="Times New Roman" w:hAnsi="Times New Roman" w:eastAsia="Times New Roman" w:cs="Times New Roman"/>
+          <w:color w:val="000000"/>
+          <w:sz w:val="24"/>
+        </w:rPr>
+        <w:t xml:space="preserve">) utilizando </w:t>
+      </w:r>
+      <w:r>
+        <w:rPr>
+          <w:rFonts w:ascii="Courier New" w:hAnsi="Courier New" w:eastAsia="Courier New" w:cs="Courier New"/>
+          <w:color w:val="000000"/>
+          <w:sz w:val="20"/>
+        </w:rPr>
+        <w:t xml:space="preserve">@RestController</w:t>
+      </w:r>
+      <w:r>
+        <w:rPr>
+          <w:rFonts w:ascii="Times New Roman" w:hAnsi="Times New Roman" w:eastAsia="Times New Roman" w:cs="Times New Roman"/>
+          <w:color w:val="000000"/>
+          <w:sz w:val="24"/>
+        </w:rPr>
+        <w:t xml:space="preserve"> y </w:t>
+      </w:r>
+      <w:r>
+        <w:rPr>
+          <w:rFonts w:ascii="Courier New" w:hAnsi="Courier New" w:eastAsia="Courier New" w:cs="Courier New"/>
+          <w:color w:val="000000"/>
+          <w:sz w:val="20"/>
+        </w:rPr>
+        <w:t xml:space="preserve">ResponseEntity</w:t>
+      </w:r>
+      <w:r>
+        <w:rPr>
+          <w:rFonts w:ascii="Times New Roman" w:hAnsi="Times New Roman" w:eastAsia="Times New Roman" w:cs="Times New Roman"/>
+          <w:color w:val="000000"/>
+          <w:sz w:val="24"/>
+        </w:rPr>
+        <w:t xml:space="preserve"> para responder datos en formato JSON, listos para ser consumidos por clientes externos (Postman, aplicaciones móviles), aplicando los verbos semánticos GET, POST, PUT y DELETE.</w:t>
+      </w:r>
+      <w:r/>
+    </w:p>
+    <w:p>
+      <w:pPr>
+        <w:pStyle w:val="704"/>
+        <w:pBdr>
+          <w:top w:val="none" w:color="000000" w:sz="4" w:space="0"/>
+          <w:left w:val="none" w:color="000000" w:sz="4" w:space="0"/>
+          <w:bottom w:val="none" w:color="000000" w:sz="4" w:space="0"/>
+          <w:right w:val="none" w:color="000000" w:sz="4" w:space="0"/>
+        </w:pBdr>
+        <w:spacing/>
+        <w:ind w:right="0" w:firstLine="0" w:left="0"/>
+        <w:rPr/>
+      </w:pPr>
+      <w:r>
+        <w:rPr>
+          <w:rFonts w:ascii="Times New Roman" w:hAnsi="Times New Roman" w:eastAsia="Times New Roman" w:cs="Times New Roman"/>
+          <w:b/>
+          <w:color w:val="000000"/>
+          <w:sz w:val="36"/>
+        </w:rPr>
+        <w:t xml:space="preserve">10. Configuración</w:t>
+      </w:r>
+      <w:r/>
+    </w:p>
+    <w:p>
+      <w:pPr>
+        <w:pBdr>
+          <w:top w:val="none" w:color="000000" w:sz="4" w:space="0"/>
+          <w:left w:val="none" w:color="000000" w:sz="4" w:space="0"/>
+          <w:bottom w:val="none" w:color="000000" w:sz="4" w:space="0"/>
+          <w:right w:val="none" w:color="000000" w:sz="4" w:space="0"/>
+        </w:pBdr>
+        <w:spacing/>
+        <w:ind w:right="0" w:firstLine="0" w:left="0"/>
+        <w:rPr/>
+      </w:pPr>
+      <w:r>
+        <w:rPr>
+          <w:rFonts w:ascii="Times New Roman" w:hAnsi="Times New Roman" w:eastAsia="Times New Roman" w:cs="Times New Roman"/>
+          <w:color w:val="000000"/>
+          <w:sz w:val="24"/>
+        </w:rPr>
+        <w:t xml:space="preserve">Fragmento del archivo </w:t>
+      </w:r>
+      <w:r>
+        <w:rPr>
+          <w:rFonts w:ascii="Courier New" w:hAnsi="Courier New" w:eastAsia="Courier New" w:cs="Courier New"/>
+          <w:color w:val="000000"/>
+          <w:sz w:val="20"/>
+        </w:rPr>
+        <w:t xml:space="preserve">application.properties</w:t>
+      </w:r>
+      <w:r>
+        <w:rPr>
+          <w:rFonts w:ascii="Times New Roman" w:hAnsi="Times New Roman" w:eastAsia="Times New Roman" w:cs="Times New Roman"/>
+          <w:color w:val="000000"/>
+          <w:sz w:val="24"/>
+        </w:rPr>
+        <w:t xml:space="preserve">:</w:t>
+      </w:r>
+      <w:r/>
+    </w:p>
+    <w:p>
+      <w:pPr>
+        <w:pBdr>
+          <w:top w:val="none" w:color="000000" w:sz="4" w:space="0"/>
+          <w:left w:val="none" w:color="000000" w:sz="4" w:space="0"/>
+          <w:bottom w:val="none" w:color="000000" w:sz="4" w:space="0"/>
+          <w:right w:val="none" w:color="000000" w:sz="4" w:space="0"/>
+        </w:pBdr>
+        <w:spacing/>
+        <w:ind w:right="0" w:firstLine="0" w:left="0"/>
+        <w:rPr/>
+      </w:pPr>
+      <w:r>
+        <w:rPr>
+          <w:rFonts w:ascii="Times New Roman" w:hAnsi="Times New Roman" w:eastAsia="Times New Roman" w:cs="Times New Roman"/>
+          <w:color w:val="000000"/>
+          <w:sz w:val="24"/>
+        </w:rPr>
+        <w:t xml:space="preserve">Properties</w:t>
+      </w:r>
+      <w:r/>
+    </w:p>
+    <w:p>
+      <w:pPr>
+        <w:pBdr>
+          <w:top w:val="none" w:color="000000" w:sz="4" w:space="0"/>
+          <w:left w:val="none" w:color="000000" w:sz="4" w:space="0"/>
+          <w:bottom w:val="none" w:color="000000" w:sz="4" w:space="0"/>
+          <w:right w:val="none" w:color="000000" w:sz="4" w:space="0"/>
+        </w:pBdr>
+        <w:spacing/>
+        <w:ind w:right="0" w:firstLine="0" w:left="0"/>
+        <w:rPr/>
+      </w:pPr>
+      <w:r>
+        <w:rPr>
+          <w:rFonts w:ascii="Courier New" w:hAnsi="Courier New" w:eastAsia="Courier New" w:cs="Courier New"/>
+          <w:color w:val="000000"/>
+          <w:sz w:val="20"/>
+        </w:rPr>
+        <w:t xml:space="preserve">spring.datasource.url=jdbc:mariadb://localhost:3306/escuelaspring.datasource.driver-class-name=org.mariadb.jdbc.Driverspring.jpa.hibernate.ddl-auto=createspring.sql.init.mode=alwaysspring.jpa.defer-datasource-initialization=truejwt.secret=EscuRedSuperSecre</w:t>
+      </w:r>
+      <w:r>
+        <w:rPr>
+          <w:rFonts w:ascii="Courier New" w:hAnsi="Courier New" w:eastAsia="Courier New" w:cs="Courier New"/>
+          <w:color w:val="000000"/>
+          <w:sz w:val="20"/>
+        </w:rPr>
+        <w:t xml:space="preserve">tKeyParaFirmaDeTokensMinimo256Bits2026UNAMjwt.expirationDateInMs=900000jwt.refreshExpirationDateInMs=604800000</w:t>
+      </w:r>
+      <w:r/>
+    </w:p>
+    <w:p>
+      <w:pPr>
+        <w:pStyle w:val="704"/>
+        <w:pBdr>
+          <w:top w:val="none" w:color="000000" w:sz="4" w:space="0"/>
+          <w:left w:val="none" w:color="000000" w:sz="4" w:space="0"/>
+          <w:bottom w:val="none" w:color="000000" w:sz="4" w:space="0"/>
+          <w:right w:val="none" w:color="000000" w:sz="4" w:space="0"/>
+        </w:pBdr>
+        <w:spacing/>
+        <w:ind w:right="0" w:firstLine="0" w:left="0"/>
+        <w:rPr/>
+      </w:pPr>
+      <w:r>
+        <w:rPr>
+          <w:rFonts w:ascii="Times New Roman" w:hAnsi="Times New Roman" w:eastAsia="Times New Roman" w:cs="Times New Roman"/>
+          <w:b/>
+          <w:color w:val="000000"/>
+          <w:sz w:val="36"/>
+        </w:rPr>
+        <w:t xml:space="preserve">11. Evidencia de Funcionamiento</w:t>
+      </w:r>
+      <w:r/>
+    </w:p>
+    <w:p>
+      <w:pPr>
+        <w:pBdr>
+          <w:top w:val="none" w:color="000000" w:sz="4" w:space="0"/>
+          <w:left w:val="none" w:color="000000" w:sz="4" w:space="0"/>
+          <w:bottom w:val="none" w:color="000000" w:sz="4" w:space="0"/>
+          <w:right w:val="none" w:color="000000" w:sz="4" w:space="0"/>
+        </w:pBdr>
+        <w:spacing/>
+        <w:ind w:right="0" w:firstLine="0" w:left="0"/>
+        <w:rPr/>
+      </w:pPr>
+      <w:r>
+        <w:rPr>
+          <w:rFonts w:ascii="Times New Roman" w:hAnsi="Times New Roman" w:eastAsia="Times New Roman" w:cs="Times New Roman"/>
+          <w:i/>
+          <w:color w:val="000000"/>
+          <w:sz w:val="24"/>
+        </w:rPr>
+        <w:t xml:space="preserve">(Toma 3 o 4 capturas de pantalla de tu sistema funcionando y pégalas aquí. Sugerencias:)</w:t>
+      </w:r>
+      <w:r/>
+    </w:p>
+    <w:p>
+      <w:pPr>
+        <w:pStyle w:val="891"/>
+        <w:numPr>
+          <w:ilvl w:val="0"/>
+          <w:numId w:val="12"/>
+        </w:numPr>
+        <w:pBdr>
+          <w:top w:val="none" w:color="000000" w:sz="4" w:space="0"/>
+          <w:left w:val="none" w:color="000000" w:sz="4" w:space="0"/>
+          <w:bottom w:val="none" w:color="000000" w:sz="4" w:space="0"/>
+          <w:right w:val="none" w:color="000000" w:sz="4" w:space="0"/>
+        </w:pBdr>
+        <w:spacing/>
+        <w:ind w:right="0"/>
+        <w:rPr/>
+      </w:pPr>
+      <w:r>
+        <w:rPr>
+          <w:rFonts w:ascii="Times New Roman" w:hAnsi="Times New Roman" w:eastAsia="Times New Roman" w:cs="Times New Roman"/>
+          <w:i/>
+          <w:color w:val="000000"/>
+          <w:sz w:val="24"/>
+        </w:rPr>
+        <w:t xml:space="preserve">Captura de la pantalla de Login.</w:t>
+      </w:r>
+      <w:r/>
+    </w:p>
+    <w:p>
+      <w:pPr>
+        <w:pStyle w:val="891"/>
+        <w:numPr>
+          <w:ilvl w:val="0"/>
+          <w:numId w:val="12"/>
+        </w:numPr>
+        <w:pBdr>
+          <w:top w:val="none" w:color="000000" w:sz="4" w:space="0"/>
+          <w:left w:val="none" w:color="000000" w:sz="4" w:space="0"/>
+          <w:bottom w:val="none" w:color="000000" w:sz="4" w:space="0"/>
+          <w:right w:val="none" w:color="000000" w:sz="4" w:space="0"/>
+        </w:pBdr>
+        <w:spacing/>
+        <w:ind w:right="0"/>
+        <w:rPr/>
+      </w:pPr>
+      <w:r>
+        <w:rPr>
+          <w:rFonts w:ascii="Times New Roman" w:hAnsi="Times New Roman" w:eastAsia="Times New Roman" w:cs="Times New Roman"/>
+          <w:i/>
+          <w:color w:val="000000"/>
+          <w:sz w:val="24"/>
+        </w:rPr>
+        <w:t xml:space="preserve">Captura del Dashboard del Administrador creando un Grupo.</w:t>
+      </w:r>
+      <w:r/>
+    </w:p>
+    <w:p>
+      <w:pPr>
+        <w:pStyle w:val="891"/>
+        <w:numPr>
+          <w:ilvl w:val="0"/>
+          <w:numId w:val="12"/>
+        </w:numPr>
+        <w:pBdr>
+          <w:top w:val="none" w:color="000000" w:sz="4" w:space="0"/>
+          <w:left w:val="none" w:color="000000" w:sz="4" w:space="0"/>
+          <w:bottom w:val="none" w:color="000000" w:sz="4" w:space="0"/>
+          <w:right w:val="none" w:color="000000" w:sz="4" w:space="0"/>
+        </w:pBdr>
+        <w:spacing/>
+        <w:ind w:right="0"/>
+        <w:rPr/>
+      </w:pPr>
+      <w:r>
+        <w:rPr>
+          <w:rFonts w:ascii="Times New Roman" w:hAnsi="Times New Roman" w:eastAsia="Times New Roman" w:cs="Times New Roman"/>
+          <w:i/>
+          <w:color w:val="000000"/>
+          <w:sz w:val="24"/>
+        </w:rPr>
+        <w:t xml:space="preserve">Captura del Alumno descargando su PDF de calificaciones.</w:t>
+      </w:r>
+      <w:r/>
+    </w:p>
+    <w:p>
+      <w:pPr>
+        <w:pStyle w:val="704"/>
+        <w:pBdr>
+          <w:top w:val="none" w:color="000000" w:sz="4" w:space="0"/>
+          <w:left w:val="none" w:color="000000" w:sz="4" w:space="0"/>
+          <w:bottom w:val="none" w:color="000000" w:sz="4" w:space="0"/>
+          <w:right w:val="none" w:color="000000" w:sz="4" w:space="0"/>
+        </w:pBdr>
+        <w:spacing/>
+        <w:ind w:right="0" w:firstLine="0" w:left="0"/>
+        <w:rPr/>
+      </w:pPr>
+      <w:r>
+        <w:rPr>
+          <w:rFonts w:ascii="Times New Roman" w:hAnsi="Times New Roman" w:eastAsia="Times New Roman" w:cs="Times New Roman"/>
+          <w:b/>
+          <w:color w:val="000000"/>
+          <w:sz w:val="36"/>
+        </w:rPr>
+        <w:t xml:space="preserve">12. Código Fuente</w:t>
+      </w:r>
+      <w:r/>
+    </w:p>
+    <w:p>
+      <w:pPr>
+        <w:pStyle w:val="891"/>
+        <w:numPr>
+          <w:ilvl w:val="0"/>
+          <w:numId w:val="13"/>
+        </w:numPr>
+        <w:pBdr>
+          <w:top w:val="none" w:color="000000" w:sz="4" w:space="0"/>
+          <w:left w:val="none" w:color="000000" w:sz="4" w:space="0"/>
+          <w:bottom w:val="none" w:color="000000" w:sz="4" w:space="0"/>
+          <w:right w:val="none" w:color="000000" w:sz="4" w:space="0"/>
+        </w:pBdr>
+        <w:spacing/>
+        <w:ind w:right="0"/>
+        <w:rPr/>
+      </w:pPr>
+      <w:r>
+        <w:rPr>
+          <w:rFonts w:ascii="Times New Roman" w:hAnsi="Times New Roman" w:eastAsia="Times New Roman" w:cs="Times New Roman"/>
+          <w:b/>
+          <w:color w:val="000000"/>
+          <w:sz w:val="24"/>
+        </w:rPr>
+        <w:t xml:space="preserve">Repositorio Git:</w:t>
+      </w:r>
+      <w:r>
+        <w:rPr>
+          <w:rFonts w:ascii="Times New Roman" w:hAnsi="Times New Roman" w:eastAsia="Times New Roman" w:cs="Times New Roman"/>
+          <w:color w:val="000000"/>
+          <w:sz w:val="24"/>
+        </w:rPr>
+        <w:t xml:space="preserve"> </w:t>
+      </w:r>
+      <w:r>
+        <w:rPr>
+          <w:rFonts w:ascii="Times New Roman" w:hAnsi="Times New Roman" w:eastAsia="Times New Roman" w:cs="Times New Roman"/>
+          <w:i/>
+          <w:color w:val="000000"/>
+          <w:sz w:val="24"/>
+        </w:rPr>
+        <w:t xml:space="preserve">(Coloca aquí el enlace a tu GitHub asegurándote de que esté en modo público)</w:t>
+      </w:r>
+      <w:r>
+        <w:rPr>
+          <w:rFonts w:ascii="Times New Roman" w:hAnsi="Times New Roman" w:eastAsia="Times New Roman" w:cs="Times New Roman"/>
+          <w:color w:val="000000"/>
+          <w:sz w:val="24"/>
+        </w:rPr>
+        <w:t xml:space="preserve">.</w:t>
+      </w:r>
+      <w:r/>
+    </w:p>
+    <w:p>
+      <w:pPr>
+        <w:pStyle w:val="891"/>
+        <w:numPr>
+          <w:ilvl w:val="0"/>
+          <w:numId w:val="13"/>
+        </w:numPr>
+        <w:pBdr>
+          <w:top w:val="none" w:color="000000" w:sz="4" w:space="0"/>
+          <w:left w:val="none" w:color="000000" w:sz="4" w:space="0"/>
+          <w:bottom w:val="none" w:color="000000" w:sz="4" w:space="0"/>
+          <w:right w:val="none" w:color="000000" w:sz="4" w:space="0"/>
+        </w:pBdr>
+        <w:spacing/>
+        <w:ind w:right="0"/>
+        <w:rPr/>
+      </w:pPr>
+      <w:r>
+        <w:rPr>
+          <w:rFonts w:ascii="Times New Roman" w:hAnsi="Times New Roman" w:eastAsia="Times New Roman" w:cs="Times New Roman"/>
+          <w:b/>
+          <w:color w:val="000000"/>
+          <w:sz w:val="24"/>
+        </w:rPr>
+        <w:t xml:space="preserve">Instrucciones de despliegue:</w:t>
+      </w:r>
+      <w:r>
+        <w:rPr>
+          <w:rFonts w:ascii="Times New Roman" w:hAnsi="Times New Roman" w:eastAsia="Times New Roman" w:cs="Times New Roman"/>
+          <w:color w:val="000000"/>
+          <w:sz w:val="24"/>
+        </w:rPr>
+        <w:t xml:space="preserve"> Para ejecutar el proyecto localmente, asegúrese de tener MariaDB corriendo en el puerto 3306 con una base de datos llamada </w:t>
+      </w:r>
+      <w:r>
+        <w:rPr>
+          <w:rFonts w:ascii="Courier New" w:hAnsi="Courier New" w:eastAsia="Courier New" w:cs="Courier New"/>
+          <w:color w:val="000000"/>
+          <w:sz w:val="20"/>
+        </w:rPr>
+        <w:t xml:space="preserve">escuela</w:t>
+      </w:r>
+      <w:r>
+        <w:rPr>
+          <w:rFonts w:ascii="Times New Roman" w:hAnsi="Times New Roman" w:eastAsia="Times New Roman" w:cs="Times New Roman"/>
+          <w:color w:val="000000"/>
+          <w:sz w:val="24"/>
+        </w:rPr>
+        <w:t xml:space="preserve">. Abra el proyecto en IntelliJ IDEA y ejecute la clase principal </w:t>
+      </w:r>
+      <w:r>
+        <w:rPr>
+          <w:rFonts w:ascii="Courier New" w:hAnsi="Courier New" w:eastAsia="Courier New" w:cs="Courier New"/>
+          <w:color w:val="000000"/>
+          <w:sz w:val="20"/>
+        </w:rPr>
+        <w:t xml:space="preserve">ConfigServletWebServerApplication</w:t>
+      </w:r>
+      <w:r>
+        <w:rPr>
+          <w:rFonts w:ascii="Times New Roman" w:hAnsi="Times New Roman" w:eastAsia="Times New Roman" w:cs="Times New Roman"/>
+          <w:color w:val="000000"/>
+          <w:sz w:val="24"/>
+        </w:rPr>
+        <w:t xml:space="preserve">. El archivo </w:t>
+      </w:r>
+      <w:r>
+        <w:rPr>
+          <w:rFonts w:ascii="Courier New" w:hAnsi="Courier New" w:eastAsia="Courier New" w:cs="Courier New"/>
+          <w:color w:val="000000"/>
+          <w:sz w:val="20"/>
+        </w:rPr>
+        <w:t xml:space="preserve">data.sql</w:t>
+      </w:r>
+      <w:r>
+        <w:rPr>
+          <w:rFonts w:ascii="Times New Roman" w:hAnsi="Times New Roman" w:eastAsia="Times New Roman" w:cs="Times New Roman"/>
+          <w:color w:val="000000"/>
+          <w:sz w:val="24"/>
+        </w:rPr>
+        <w:t xml:space="preserve"> creará los registros iniciales. Acceda mediante </w:t>
+      </w:r>
+      <w:r>
+        <w:rPr>
+          <w:rFonts w:ascii="Courier New" w:hAnsi="Courier New" w:eastAsia="Courier New" w:cs="Courier New"/>
+          <w:color w:val="000000"/>
+          <w:sz w:val="20"/>
+        </w:rPr>
+        <w:t xml:space="preserve">http://localhost:8080/</w:t>
+      </w:r>
+      <w:r>
+        <w:rPr>
+          <w:rFonts w:ascii="Times New Roman" w:hAnsi="Times New Roman" w:eastAsia="Times New Roman" w:cs="Times New Roman"/>
+          <w:color w:val="000000"/>
+          <w:sz w:val="24"/>
+        </w:rPr>
+        <w:t xml:space="preserve">.</w:t>
+      </w:r>
+      <w:r/>
+    </w:p>
+    <w:p>
+      <w:pPr>
+        <w:pStyle w:val="704"/>
+        <w:pBdr>
+          <w:top w:val="none" w:color="000000" w:sz="4" w:space="0"/>
+          <w:left w:val="none" w:color="000000" w:sz="4" w:space="0"/>
+          <w:bottom w:val="none" w:color="000000" w:sz="4" w:space="0"/>
+          <w:right w:val="none" w:color="000000" w:sz="4" w:space="0"/>
+        </w:pBdr>
+        <w:spacing/>
+        <w:ind w:right="0" w:firstLine="0" w:left="0"/>
+        <w:rPr/>
+      </w:pPr>
+      <w:r>
+        <w:rPr>
+          <w:rFonts w:ascii="Times New Roman" w:hAnsi="Times New Roman" w:eastAsia="Times New Roman" w:cs="Times New Roman"/>
+          <w:b/>
+          <w:color w:val="000000"/>
+          <w:sz w:val="36"/>
+        </w:rPr>
+        <w:t xml:space="preserve">13. Conclusiones</w:t>
+      </w:r>
+      <w:r/>
+    </w:p>
+    <w:p>
+      <w:pPr>
+        <w:pBdr>
+          <w:top w:val="none" w:color="000000" w:sz="4" w:space="0"/>
+          <w:left w:val="none" w:color="000000" w:sz="4" w:space="0"/>
+          <w:bottom w:val="none" w:color="000000" w:sz="4" w:space="0"/>
+          <w:right w:val="none" w:color="000000" w:sz="4" w:space="0"/>
+        </w:pBdr>
+        <w:spacing/>
+        <w:ind w:right="0" w:firstLine="0" w:left="0"/>
+        <w:rPr/>
+      </w:pPr>
+      <w:r>
+        <w:rPr>
+          <w:rFonts w:ascii="Times New Roman" w:hAnsi="Times New Roman" w:eastAsia="Times New Roman" w:cs="Times New Roman"/>
+          <w:i/>
+          <w:color w:val="000000"/>
+          <w:sz w:val="24"/>
+        </w:rPr>
+        <w:t xml:space="preserve">(Redacta un párrafo final expresando cómo la integración de Spring Security y JWT robusteció el sistema frente al manejo tradicional de sesiones, y el reto que supuso integrarlo con las vistas de Thymeleaf mediante cookies).</w:t>
+      </w:r>
+      <w:r/>
+    </w:p>
+    <w:p>
+      <w:pPr>
+        <w:pBdr/>
+        <w:spacing/>
+        <w:ind/>
+        <w:jc w:val="center"/>
+        <w:rPr>
+          <w:b w:val="0"/>
+          <w:bCs w:val="0"/>
+          <w:i w:val="0"/>
+          <w:u w:val="none"/>
+        </w:rPr>
+      </w:pPr>
+      <w:r>
+        <w:rPr>
+          <w:b/>
+          <w:bCs/>
+          <w:i/>
+          <w:iCs/>
+          <w:highlight w:val="none"/>
+          <w:u w:val="single"/>
+        </w:rPr>
+      </w:r>
+      <w:r>
+        <w:rPr>
+          <w:b/>
+          <w:bCs/>
+          <w:i/>
+          <w:iCs/>
+          <w:highlight w:val="none"/>
+          <w:u w:val="single"/>
+        </w:rPr>
+      </w:r>
+      <w:r>
+        <w:rPr>
+          <w:b/>
+          <w:bCs/>
+          <w:i/>
+          <w:iCs/>
+          <w:highlight w:val="none"/>
+          <w:u w:val="single"/>
         </w:rPr>
       </w:r>
     </w:p>
@@ -2377,6 +4916,1295 @@
       <w:suff w:val="tab"/>
     </w:lvl>
   </w:abstractNum>
+  <w:abstractNum w:abstractNumId="4">
+    <w:nsid w:val="060D81E9"/>
+    <w:lvl w:ilvl="0">
+      <w:isLgl w:val="false"/>
+      <w:lvlJc w:val="right"/>
+      <w:lvlText w:val="%1."/>
+      <w:numFmt w:val="decimal"/>
+      <w:pPr>
+        <w:pBdr/>
+        <w:spacing/>
+        <w:ind w:hanging="360" w:left="709"/>
+      </w:pPr>
+      <w:rPr/>
+      <w:start w:val="1"/>
+      <w:suff w:val="tab"/>
+    </w:lvl>
+    <w:lvl w:ilvl="1">
+      <w:isLgl w:val="false"/>
+      <w:lvlJc w:val="right"/>
+      <w:lvlText w:val="%2."/>
+      <w:numFmt w:val="decimal"/>
+      <w:pPr>
+        <w:pBdr/>
+        <w:spacing/>
+        <w:ind w:hanging="360" w:left="1429"/>
+      </w:pPr>
+      <w:rPr/>
+      <w:start w:val="1"/>
+      <w:suff w:val="tab"/>
+    </w:lvl>
+    <w:lvl w:ilvl="2">
+      <w:isLgl w:val="false"/>
+      <w:lvlJc w:val="right"/>
+      <w:lvlText w:val="%3."/>
+      <w:numFmt w:val="decimal"/>
+      <w:pPr>
+        <w:pBdr/>
+        <w:spacing/>
+        <w:ind w:hanging="360" w:left="2149"/>
+      </w:pPr>
+      <w:rPr/>
+      <w:start w:val="1"/>
+      <w:suff w:val="tab"/>
+    </w:lvl>
+    <w:lvl w:ilvl="3">
+      <w:isLgl w:val="false"/>
+      <w:lvlJc w:val="right"/>
+      <w:lvlText w:val="%4."/>
+      <w:numFmt w:val="decimal"/>
+      <w:pPr>
+        <w:pBdr/>
+        <w:spacing/>
+        <w:ind w:hanging="360" w:left="2869"/>
+      </w:pPr>
+      <w:rPr/>
+      <w:start w:val="1"/>
+      <w:suff w:val="tab"/>
+    </w:lvl>
+    <w:lvl w:ilvl="4">
+      <w:isLgl w:val="false"/>
+      <w:lvlJc w:val="right"/>
+      <w:lvlText w:val="%5."/>
+      <w:numFmt w:val="decimal"/>
+      <w:pPr>
+        <w:pBdr/>
+        <w:spacing/>
+        <w:ind w:hanging="360" w:left="3589"/>
+      </w:pPr>
+      <w:rPr/>
+      <w:start w:val="1"/>
+      <w:suff w:val="tab"/>
+    </w:lvl>
+    <w:lvl w:ilvl="5">
+      <w:isLgl w:val="false"/>
+      <w:lvlJc w:val="right"/>
+      <w:lvlText w:val="%6."/>
+      <w:numFmt w:val="decimal"/>
+      <w:pPr>
+        <w:pBdr/>
+        <w:spacing/>
+        <w:ind w:hanging="360" w:left="4309"/>
+      </w:pPr>
+      <w:rPr/>
+      <w:start w:val="1"/>
+      <w:suff w:val="tab"/>
+    </w:lvl>
+    <w:lvl w:ilvl="6">
+      <w:isLgl w:val="false"/>
+      <w:lvlJc w:val="right"/>
+      <w:lvlText w:val="%7."/>
+      <w:numFmt w:val="decimal"/>
+      <w:pPr>
+        <w:pBdr/>
+        <w:spacing/>
+        <w:ind w:hanging="360" w:left="5029"/>
+      </w:pPr>
+      <w:rPr/>
+      <w:start w:val="1"/>
+      <w:suff w:val="tab"/>
+    </w:lvl>
+    <w:lvl w:ilvl="7">
+      <w:isLgl w:val="false"/>
+      <w:lvlJc w:val="right"/>
+      <w:lvlText w:val="%8."/>
+      <w:numFmt w:val="decimal"/>
+      <w:pPr>
+        <w:pBdr/>
+        <w:spacing/>
+        <w:ind w:hanging="360" w:left="5749"/>
+      </w:pPr>
+      <w:rPr/>
+      <w:start w:val="1"/>
+      <w:suff w:val="tab"/>
+    </w:lvl>
+    <w:lvl w:ilvl="8">
+      <w:isLgl w:val="false"/>
+      <w:lvlJc w:val="right"/>
+      <w:lvlText w:val="%9."/>
+      <w:numFmt w:val="decimal"/>
+      <w:pPr>
+        <w:pBdr/>
+        <w:spacing/>
+        <w:ind w:hanging="360" w:left="6469"/>
+      </w:pPr>
+      <w:rPr/>
+      <w:start w:val="1"/>
+      <w:suff w:val="tab"/>
+    </w:lvl>
+  </w:abstractNum>
+  <w:abstractNum w:abstractNumId="5">
+    <w:nsid w:val="60D1F80C"/>
+    <w:lvl w:ilvl="0">
+      <w:isLgl w:val="false"/>
+      <w:lvlJc w:val="left"/>
+      <w:lvlText w:val="·"/>
+      <w:numFmt w:val="bullet"/>
+      <w:pPr>
+        <w:pBdr/>
+        <w:spacing/>
+        <w:ind w:hanging="360" w:left="709"/>
+      </w:pPr>
+      <w:rPr>
+        <w:rFonts w:hint="default" w:ascii="Symbol" w:hAnsi="Symbol" w:eastAsia="Symbol" w:cs="Symbol"/>
+      </w:rPr>
+      <w:start w:val="1"/>
+      <w:suff w:val="tab"/>
+    </w:lvl>
+    <w:lvl w:ilvl="1">
+      <w:isLgl w:val="false"/>
+      <w:lvlJc w:val="left"/>
+      <w:lvlText w:val="o"/>
+      <w:numFmt w:val="bullet"/>
+      <w:pPr>
+        <w:pBdr/>
+        <w:spacing/>
+        <w:ind w:hanging="360" w:left="1429"/>
+      </w:pPr>
+      <w:rPr>
+        <w:rFonts w:hint="default" w:ascii="Courier New" w:hAnsi="Courier New" w:eastAsia="Courier New" w:cs="Courier New"/>
+      </w:rPr>
+      <w:start w:val="1"/>
+      <w:suff w:val="tab"/>
+    </w:lvl>
+    <w:lvl w:ilvl="2">
+      <w:isLgl w:val="false"/>
+      <w:lvlJc w:val="left"/>
+      <w:lvlText w:val="§"/>
+      <w:numFmt w:val="bullet"/>
+      <w:pPr>
+        <w:pBdr/>
+        <w:spacing/>
+        <w:ind w:hanging="360" w:left="2149"/>
+      </w:pPr>
+      <w:rPr>
+        <w:rFonts w:hint="default" w:ascii="Wingdings" w:hAnsi="Wingdings" w:eastAsia="Wingdings" w:cs="Wingdings"/>
+      </w:rPr>
+      <w:start w:val="1"/>
+      <w:suff w:val="tab"/>
+    </w:lvl>
+    <w:lvl w:ilvl="3">
+      <w:isLgl w:val="false"/>
+      <w:lvlJc w:val="left"/>
+      <w:lvlText w:val="·"/>
+      <w:numFmt w:val="bullet"/>
+      <w:pPr>
+        <w:pBdr/>
+        <w:spacing/>
+        <w:ind w:hanging="360" w:left="2869"/>
+      </w:pPr>
+      <w:rPr>
+        <w:rFonts w:hint="default" w:ascii="Symbol" w:hAnsi="Symbol" w:eastAsia="Symbol" w:cs="Symbol"/>
+      </w:rPr>
+      <w:start w:val="1"/>
+      <w:suff w:val="tab"/>
+    </w:lvl>
+    <w:lvl w:ilvl="4">
+      <w:isLgl w:val="false"/>
+      <w:lvlJc w:val="left"/>
+      <w:lvlText w:val="o"/>
+      <w:numFmt w:val="bullet"/>
+      <w:pPr>
+        <w:pBdr/>
+        <w:spacing/>
+        <w:ind w:hanging="360" w:left="3589"/>
+      </w:pPr>
+      <w:rPr>
+        <w:rFonts w:hint="default" w:ascii="Courier New" w:hAnsi="Courier New" w:eastAsia="Courier New" w:cs="Courier New"/>
+      </w:rPr>
+      <w:start w:val="1"/>
+      <w:suff w:val="tab"/>
+    </w:lvl>
+    <w:lvl w:ilvl="5">
+      <w:isLgl w:val="false"/>
+      <w:lvlJc w:val="left"/>
+      <w:lvlText w:val="§"/>
+      <w:numFmt w:val="bullet"/>
+      <w:pPr>
+        <w:pBdr/>
+        <w:spacing/>
+        <w:ind w:hanging="360" w:left="4309"/>
+      </w:pPr>
+      <w:rPr>
+        <w:rFonts w:hint="default" w:ascii="Wingdings" w:hAnsi="Wingdings" w:eastAsia="Wingdings" w:cs="Wingdings"/>
+      </w:rPr>
+      <w:start w:val="1"/>
+      <w:suff w:val="tab"/>
+    </w:lvl>
+    <w:lvl w:ilvl="6">
+      <w:isLgl w:val="false"/>
+      <w:lvlJc w:val="left"/>
+      <w:lvlText w:val="·"/>
+      <w:numFmt w:val="bullet"/>
+      <w:pPr>
+        <w:pBdr/>
+        <w:spacing/>
+        <w:ind w:hanging="360" w:left="5029"/>
+      </w:pPr>
+      <w:rPr>
+        <w:rFonts w:hint="default" w:ascii="Symbol" w:hAnsi="Symbol" w:eastAsia="Symbol" w:cs="Symbol"/>
+      </w:rPr>
+      <w:start w:val="1"/>
+      <w:suff w:val="tab"/>
+    </w:lvl>
+    <w:lvl w:ilvl="7">
+      <w:isLgl w:val="false"/>
+      <w:lvlJc w:val="left"/>
+      <w:lvlText w:val="o"/>
+      <w:numFmt w:val="bullet"/>
+      <w:pPr>
+        <w:pBdr/>
+        <w:spacing/>
+        <w:ind w:hanging="360" w:left="5749"/>
+      </w:pPr>
+      <w:rPr>
+        <w:rFonts w:hint="default" w:ascii="Courier New" w:hAnsi="Courier New" w:eastAsia="Courier New" w:cs="Courier New"/>
+      </w:rPr>
+      <w:start w:val="1"/>
+      <w:suff w:val="tab"/>
+    </w:lvl>
+    <w:lvl w:ilvl="8">
+      <w:isLgl w:val="false"/>
+      <w:lvlJc w:val="left"/>
+      <w:lvlText w:val="§"/>
+      <w:numFmt w:val="bullet"/>
+      <w:pPr>
+        <w:pBdr/>
+        <w:spacing/>
+        <w:ind w:hanging="360" w:left="6469"/>
+      </w:pPr>
+      <w:rPr>
+        <w:rFonts w:hint="default" w:ascii="Wingdings" w:hAnsi="Wingdings" w:eastAsia="Wingdings" w:cs="Wingdings"/>
+      </w:rPr>
+      <w:start w:val="1"/>
+      <w:suff w:val="tab"/>
+    </w:lvl>
+  </w:abstractNum>
+  <w:abstractNum w:abstractNumId="6">
+    <w:nsid w:val="50E37C64"/>
+    <w:lvl w:ilvl="0">
+      <w:isLgl w:val="false"/>
+      <w:lvlJc w:val="right"/>
+      <w:lvlText w:val="%1."/>
+      <w:numFmt w:val="decimal"/>
+      <w:pPr>
+        <w:pBdr/>
+        <w:spacing/>
+        <w:ind w:hanging="360" w:left="709"/>
+      </w:pPr>
+      <w:rPr/>
+      <w:start w:val="1"/>
+      <w:suff w:val="tab"/>
+    </w:lvl>
+    <w:lvl w:ilvl="1">
+      <w:isLgl w:val="false"/>
+      <w:lvlJc w:val="right"/>
+      <w:lvlText w:val="%2."/>
+      <w:numFmt w:val="decimal"/>
+      <w:pPr>
+        <w:pBdr/>
+        <w:spacing/>
+        <w:ind w:hanging="360" w:left="1429"/>
+      </w:pPr>
+      <w:rPr/>
+      <w:start w:val="1"/>
+      <w:suff w:val="tab"/>
+    </w:lvl>
+    <w:lvl w:ilvl="2">
+      <w:isLgl w:val="false"/>
+      <w:lvlJc w:val="right"/>
+      <w:lvlText w:val="%3."/>
+      <w:numFmt w:val="decimal"/>
+      <w:pPr>
+        <w:pBdr/>
+        <w:spacing/>
+        <w:ind w:hanging="360" w:left="2149"/>
+      </w:pPr>
+      <w:rPr/>
+      <w:start w:val="1"/>
+      <w:suff w:val="tab"/>
+    </w:lvl>
+    <w:lvl w:ilvl="3">
+      <w:isLgl w:val="false"/>
+      <w:lvlJc w:val="right"/>
+      <w:lvlText w:val="%4."/>
+      <w:numFmt w:val="decimal"/>
+      <w:pPr>
+        <w:pBdr/>
+        <w:spacing/>
+        <w:ind w:hanging="360" w:left="2869"/>
+      </w:pPr>
+      <w:rPr/>
+      <w:start w:val="1"/>
+      <w:suff w:val="tab"/>
+    </w:lvl>
+    <w:lvl w:ilvl="4">
+      <w:isLgl w:val="false"/>
+      <w:lvlJc w:val="right"/>
+      <w:lvlText w:val="%5."/>
+      <w:numFmt w:val="decimal"/>
+      <w:pPr>
+        <w:pBdr/>
+        <w:spacing/>
+        <w:ind w:hanging="360" w:left="3589"/>
+      </w:pPr>
+      <w:rPr/>
+      <w:start w:val="1"/>
+      <w:suff w:val="tab"/>
+    </w:lvl>
+    <w:lvl w:ilvl="5">
+      <w:isLgl w:val="false"/>
+      <w:lvlJc w:val="right"/>
+      <w:lvlText w:val="%6."/>
+      <w:numFmt w:val="decimal"/>
+      <w:pPr>
+        <w:pBdr/>
+        <w:spacing/>
+        <w:ind w:hanging="360" w:left="4309"/>
+      </w:pPr>
+      <w:rPr/>
+      <w:start w:val="1"/>
+      <w:suff w:val="tab"/>
+    </w:lvl>
+    <w:lvl w:ilvl="6">
+      <w:isLgl w:val="false"/>
+      <w:lvlJc w:val="right"/>
+      <w:lvlText w:val="%7."/>
+      <w:numFmt w:val="decimal"/>
+      <w:pPr>
+        <w:pBdr/>
+        <w:spacing/>
+        <w:ind w:hanging="360" w:left="5029"/>
+      </w:pPr>
+      <w:rPr/>
+      <w:start w:val="1"/>
+      <w:suff w:val="tab"/>
+    </w:lvl>
+    <w:lvl w:ilvl="7">
+      <w:isLgl w:val="false"/>
+      <w:lvlJc w:val="right"/>
+      <w:lvlText w:val="%8."/>
+      <w:numFmt w:val="decimal"/>
+      <w:pPr>
+        <w:pBdr/>
+        <w:spacing/>
+        <w:ind w:hanging="360" w:left="5749"/>
+      </w:pPr>
+      <w:rPr/>
+      <w:start w:val="1"/>
+      <w:suff w:val="tab"/>
+    </w:lvl>
+    <w:lvl w:ilvl="8">
+      <w:isLgl w:val="false"/>
+      <w:lvlJc w:val="right"/>
+      <w:lvlText w:val="%9."/>
+      <w:numFmt w:val="decimal"/>
+      <w:pPr>
+        <w:pBdr/>
+        <w:spacing/>
+        <w:ind w:hanging="360" w:left="6469"/>
+      </w:pPr>
+      <w:rPr/>
+      <w:start w:val="1"/>
+      <w:suff w:val="tab"/>
+    </w:lvl>
+  </w:abstractNum>
+  <w:abstractNum w:abstractNumId="7">
+    <w:nsid w:val="6F9E59B1"/>
+    <w:lvl w:ilvl="0">
+      <w:isLgl w:val="false"/>
+      <w:lvlJc w:val="left"/>
+      <w:lvlText w:val="·"/>
+      <w:numFmt w:val="bullet"/>
+      <w:pPr>
+        <w:pBdr/>
+        <w:spacing/>
+        <w:ind w:hanging="360" w:left="709"/>
+      </w:pPr>
+      <w:rPr>
+        <w:rFonts w:hint="default" w:ascii="Symbol" w:hAnsi="Symbol" w:eastAsia="Symbol" w:cs="Symbol"/>
+      </w:rPr>
+      <w:start w:val="1"/>
+      <w:suff w:val="tab"/>
+    </w:lvl>
+    <w:lvl w:ilvl="1">
+      <w:isLgl w:val="false"/>
+      <w:lvlJc w:val="left"/>
+      <w:lvlText w:val="o"/>
+      <w:numFmt w:val="bullet"/>
+      <w:pPr>
+        <w:pBdr/>
+        <w:spacing/>
+        <w:ind w:hanging="360" w:left="1429"/>
+      </w:pPr>
+      <w:rPr>
+        <w:rFonts w:hint="default" w:ascii="Courier New" w:hAnsi="Courier New" w:eastAsia="Courier New" w:cs="Courier New"/>
+      </w:rPr>
+      <w:start w:val="1"/>
+      <w:suff w:val="tab"/>
+    </w:lvl>
+    <w:lvl w:ilvl="2">
+      <w:isLgl w:val="false"/>
+      <w:lvlJc w:val="left"/>
+      <w:lvlText w:val="§"/>
+      <w:numFmt w:val="bullet"/>
+      <w:pPr>
+        <w:pBdr/>
+        <w:spacing/>
+        <w:ind w:hanging="360" w:left="2149"/>
+      </w:pPr>
+      <w:rPr>
+        <w:rFonts w:hint="default" w:ascii="Wingdings" w:hAnsi="Wingdings" w:eastAsia="Wingdings" w:cs="Wingdings"/>
+      </w:rPr>
+      <w:start w:val="1"/>
+      <w:suff w:val="tab"/>
+    </w:lvl>
+    <w:lvl w:ilvl="3">
+      <w:isLgl w:val="false"/>
+      <w:lvlJc w:val="left"/>
+      <w:lvlText w:val="·"/>
+      <w:numFmt w:val="bullet"/>
+      <w:pPr>
+        <w:pBdr/>
+        <w:spacing/>
+        <w:ind w:hanging="360" w:left="2869"/>
+      </w:pPr>
+      <w:rPr>
+        <w:rFonts w:hint="default" w:ascii="Symbol" w:hAnsi="Symbol" w:eastAsia="Symbol" w:cs="Symbol"/>
+      </w:rPr>
+      <w:start w:val="1"/>
+      <w:suff w:val="tab"/>
+    </w:lvl>
+    <w:lvl w:ilvl="4">
+      <w:isLgl w:val="false"/>
+      <w:lvlJc w:val="left"/>
+      <w:lvlText w:val="o"/>
+      <w:numFmt w:val="bullet"/>
+      <w:pPr>
+        <w:pBdr/>
+        <w:spacing/>
+        <w:ind w:hanging="360" w:left="3589"/>
+      </w:pPr>
+      <w:rPr>
+        <w:rFonts w:hint="default" w:ascii="Courier New" w:hAnsi="Courier New" w:eastAsia="Courier New" w:cs="Courier New"/>
+      </w:rPr>
+      <w:start w:val="1"/>
+      <w:suff w:val="tab"/>
+    </w:lvl>
+    <w:lvl w:ilvl="5">
+      <w:isLgl w:val="false"/>
+      <w:lvlJc w:val="left"/>
+      <w:lvlText w:val="§"/>
+      <w:numFmt w:val="bullet"/>
+      <w:pPr>
+        <w:pBdr/>
+        <w:spacing/>
+        <w:ind w:hanging="360" w:left="4309"/>
+      </w:pPr>
+      <w:rPr>
+        <w:rFonts w:hint="default" w:ascii="Wingdings" w:hAnsi="Wingdings" w:eastAsia="Wingdings" w:cs="Wingdings"/>
+      </w:rPr>
+      <w:start w:val="1"/>
+      <w:suff w:val="tab"/>
+    </w:lvl>
+    <w:lvl w:ilvl="6">
+      <w:isLgl w:val="false"/>
+      <w:lvlJc w:val="left"/>
+      <w:lvlText w:val="·"/>
+      <w:numFmt w:val="bullet"/>
+      <w:pPr>
+        <w:pBdr/>
+        <w:spacing/>
+        <w:ind w:hanging="360" w:left="5029"/>
+      </w:pPr>
+      <w:rPr>
+        <w:rFonts w:hint="default" w:ascii="Symbol" w:hAnsi="Symbol" w:eastAsia="Symbol" w:cs="Symbol"/>
+      </w:rPr>
+      <w:start w:val="1"/>
+      <w:suff w:val="tab"/>
+    </w:lvl>
+    <w:lvl w:ilvl="7">
+      <w:isLgl w:val="false"/>
+      <w:lvlJc w:val="left"/>
+      <w:lvlText w:val="o"/>
+      <w:numFmt w:val="bullet"/>
+      <w:pPr>
+        <w:pBdr/>
+        <w:spacing/>
+        <w:ind w:hanging="360" w:left="5749"/>
+      </w:pPr>
+      <w:rPr>
+        <w:rFonts w:hint="default" w:ascii="Courier New" w:hAnsi="Courier New" w:eastAsia="Courier New" w:cs="Courier New"/>
+      </w:rPr>
+      <w:start w:val="1"/>
+      <w:suff w:val="tab"/>
+    </w:lvl>
+    <w:lvl w:ilvl="8">
+      <w:isLgl w:val="false"/>
+      <w:lvlJc w:val="left"/>
+      <w:lvlText w:val="§"/>
+      <w:numFmt w:val="bullet"/>
+      <w:pPr>
+        <w:pBdr/>
+        <w:spacing/>
+        <w:ind w:hanging="360" w:left="6469"/>
+      </w:pPr>
+      <w:rPr>
+        <w:rFonts w:hint="default" w:ascii="Wingdings" w:hAnsi="Wingdings" w:eastAsia="Wingdings" w:cs="Wingdings"/>
+      </w:rPr>
+      <w:start w:val="1"/>
+      <w:suff w:val="tab"/>
+    </w:lvl>
+  </w:abstractNum>
+  <w:abstractNum w:abstractNumId="8">
+    <w:nsid w:val="77643A73"/>
+    <w:lvl w:ilvl="0">
+      <w:isLgl w:val="false"/>
+      <w:lvlJc w:val="left"/>
+      <w:lvlText w:val="·"/>
+      <w:numFmt w:val="bullet"/>
+      <w:pPr>
+        <w:pBdr/>
+        <w:spacing/>
+        <w:ind w:hanging="360" w:left="709"/>
+      </w:pPr>
+      <w:rPr>
+        <w:rFonts w:hint="default" w:ascii="Symbol" w:hAnsi="Symbol" w:eastAsia="Symbol" w:cs="Symbol"/>
+      </w:rPr>
+      <w:start w:val="1"/>
+      <w:suff w:val="tab"/>
+    </w:lvl>
+    <w:lvl w:ilvl="1">
+      <w:isLgl w:val="false"/>
+      <w:lvlJc w:val="left"/>
+      <w:lvlText w:val="o"/>
+      <w:numFmt w:val="bullet"/>
+      <w:pPr>
+        <w:pBdr/>
+        <w:spacing/>
+        <w:ind w:hanging="360" w:left="1429"/>
+      </w:pPr>
+      <w:rPr>
+        <w:rFonts w:hint="default" w:ascii="Courier New" w:hAnsi="Courier New" w:eastAsia="Courier New" w:cs="Courier New"/>
+      </w:rPr>
+      <w:start w:val="1"/>
+      <w:suff w:val="tab"/>
+    </w:lvl>
+    <w:lvl w:ilvl="2">
+      <w:isLgl w:val="false"/>
+      <w:lvlJc w:val="left"/>
+      <w:lvlText w:val="§"/>
+      <w:numFmt w:val="bullet"/>
+      <w:pPr>
+        <w:pBdr/>
+        <w:spacing/>
+        <w:ind w:hanging="360" w:left="2149"/>
+      </w:pPr>
+      <w:rPr>
+        <w:rFonts w:hint="default" w:ascii="Wingdings" w:hAnsi="Wingdings" w:eastAsia="Wingdings" w:cs="Wingdings"/>
+      </w:rPr>
+      <w:start w:val="1"/>
+      <w:suff w:val="tab"/>
+    </w:lvl>
+    <w:lvl w:ilvl="3">
+      <w:isLgl w:val="false"/>
+      <w:lvlJc w:val="left"/>
+      <w:lvlText w:val="·"/>
+      <w:numFmt w:val="bullet"/>
+      <w:pPr>
+        <w:pBdr/>
+        <w:spacing/>
+        <w:ind w:hanging="360" w:left="2869"/>
+      </w:pPr>
+      <w:rPr>
+        <w:rFonts w:hint="default" w:ascii="Symbol" w:hAnsi="Symbol" w:eastAsia="Symbol" w:cs="Symbol"/>
+      </w:rPr>
+      <w:start w:val="1"/>
+      <w:suff w:val="tab"/>
+    </w:lvl>
+    <w:lvl w:ilvl="4">
+      <w:isLgl w:val="false"/>
+      <w:lvlJc w:val="left"/>
+      <w:lvlText w:val="o"/>
+      <w:numFmt w:val="bullet"/>
+      <w:pPr>
+        <w:pBdr/>
+        <w:spacing/>
+        <w:ind w:hanging="360" w:left="3589"/>
+      </w:pPr>
+      <w:rPr>
+        <w:rFonts w:hint="default" w:ascii="Courier New" w:hAnsi="Courier New" w:eastAsia="Courier New" w:cs="Courier New"/>
+      </w:rPr>
+      <w:start w:val="1"/>
+      <w:suff w:val="tab"/>
+    </w:lvl>
+    <w:lvl w:ilvl="5">
+      <w:isLgl w:val="false"/>
+      <w:lvlJc w:val="left"/>
+      <w:lvlText w:val="§"/>
+      <w:numFmt w:val="bullet"/>
+      <w:pPr>
+        <w:pBdr/>
+        <w:spacing/>
+        <w:ind w:hanging="360" w:left="4309"/>
+      </w:pPr>
+      <w:rPr>
+        <w:rFonts w:hint="default" w:ascii="Wingdings" w:hAnsi="Wingdings" w:eastAsia="Wingdings" w:cs="Wingdings"/>
+      </w:rPr>
+      <w:start w:val="1"/>
+      <w:suff w:val="tab"/>
+    </w:lvl>
+    <w:lvl w:ilvl="6">
+      <w:isLgl w:val="false"/>
+      <w:lvlJc w:val="left"/>
+      <w:lvlText w:val="·"/>
+      <w:numFmt w:val="bullet"/>
+      <w:pPr>
+        <w:pBdr/>
+        <w:spacing/>
+        <w:ind w:hanging="360" w:left="5029"/>
+      </w:pPr>
+      <w:rPr>
+        <w:rFonts w:hint="default" w:ascii="Symbol" w:hAnsi="Symbol" w:eastAsia="Symbol" w:cs="Symbol"/>
+      </w:rPr>
+      <w:start w:val="1"/>
+      <w:suff w:val="tab"/>
+    </w:lvl>
+    <w:lvl w:ilvl="7">
+      <w:isLgl w:val="false"/>
+      <w:lvlJc w:val="left"/>
+      <w:lvlText w:val="o"/>
+      <w:numFmt w:val="bullet"/>
+      <w:pPr>
+        <w:pBdr/>
+        <w:spacing/>
+        <w:ind w:hanging="360" w:left="5749"/>
+      </w:pPr>
+      <w:rPr>
+        <w:rFonts w:hint="default" w:ascii="Courier New" w:hAnsi="Courier New" w:eastAsia="Courier New" w:cs="Courier New"/>
+      </w:rPr>
+      <w:start w:val="1"/>
+      <w:suff w:val="tab"/>
+    </w:lvl>
+    <w:lvl w:ilvl="8">
+      <w:isLgl w:val="false"/>
+      <w:lvlJc w:val="left"/>
+      <w:lvlText w:val="§"/>
+      <w:numFmt w:val="bullet"/>
+      <w:pPr>
+        <w:pBdr/>
+        <w:spacing/>
+        <w:ind w:hanging="360" w:left="6469"/>
+      </w:pPr>
+      <w:rPr>
+        <w:rFonts w:hint="default" w:ascii="Wingdings" w:hAnsi="Wingdings" w:eastAsia="Wingdings" w:cs="Wingdings"/>
+      </w:rPr>
+      <w:start w:val="1"/>
+      <w:suff w:val="tab"/>
+    </w:lvl>
+  </w:abstractNum>
+  <w:abstractNum w:abstractNumId="9">
+    <w:nsid w:val="0A905233"/>
+    <w:lvl w:ilvl="0">
+      <w:isLgl w:val="false"/>
+      <w:lvlJc w:val="left"/>
+      <w:lvlText w:val="·"/>
+      <w:numFmt w:val="bullet"/>
+      <w:pPr>
+        <w:pBdr/>
+        <w:spacing/>
+        <w:ind w:hanging="360" w:left="709"/>
+      </w:pPr>
+      <w:rPr>
+        <w:rFonts w:hint="default" w:ascii="Symbol" w:hAnsi="Symbol" w:eastAsia="Symbol" w:cs="Symbol"/>
+      </w:rPr>
+      <w:start w:val="1"/>
+      <w:suff w:val="tab"/>
+    </w:lvl>
+    <w:lvl w:ilvl="1">
+      <w:isLgl w:val="false"/>
+      <w:lvlJc w:val="left"/>
+      <w:lvlText w:val="o"/>
+      <w:numFmt w:val="bullet"/>
+      <w:pPr>
+        <w:pBdr/>
+        <w:spacing/>
+        <w:ind w:hanging="360" w:left="1429"/>
+      </w:pPr>
+      <w:rPr>
+        <w:rFonts w:hint="default" w:ascii="Courier New" w:hAnsi="Courier New" w:eastAsia="Courier New" w:cs="Courier New"/>
+      </w:rPr>
+      <w:start w:val="1"/>
+      <w:suff w:val="tab"/>
+    </w:lvl>
+    <w:lvl w:ilvl="2">
+      <w:isLgl w:val="false"/>
+      <w:lvlJc w:val="left"/>
+      <w:lvlText w:val="§"/>
+      <w:numFmt w:val="bullet"/>
+      <w:pPr>
+        <w:pBdr/>
+        <w:spacing/>
+        <w:ind w:hanging="360" w:left="2149"/>
+      </w:pPr>
+      <w:rPr>
+        <w:rFonts w:hint="default" w:ascii="Wingdings" w:hAnsi="Wingdings" w:eastAsia="Wingdings" w:cs="Wingdings"/>
+      </w:rPr>
+      <w:start w:val="1"/>
+      <w:suff w:val="tab"/>
+    </w:lvl>
+    <w:lvl w:ilvl="3">
+      <w:isLgl w:val="false"/>
+      <w:lvlJc w:val="left"/>
+      <w:lvlText w:val="·"/>
+      <w:numFmt w:val="bullet"/>
+      <w:pPr>
+        <w:pBdr/>
+        <w:spacing/>
+        <w:ind w:hanging="360" w:left="2869"/>
+      </w:pPr>
+      <w:rPr>
+        <w:rFonts w:hint="default" w:ascii="Symbol" w:hAnsi="Symbol" w:eastAsia="Symbol" w:cs="Symbol"/>
+      </w:rPr>
+      <w:start w:val="1"/>
+      <w:suff w:val="tab"/>
+    </w:lvl>
+    <w:lvl w:ilvl="4">
+      <w:isLgl w:val="false"/>
+      <w:lvlJc w:val="left"/>
+      <w:lvlText w:val="o"/>
+      <w:numFmt w:val="bullet"/>
+      <w:pPr>
+        <w:pBdr/>
+        <w:spacing/>
+        <w:ind w:hanging="360" w:left="3589"/>
+      </w:pPr>
+      <w:rPr>
+        <w:rFonts w:hint="default" w:ascii="Courier New" w:hAnsi="Courier New" w:eastAsia="Courier New" w:cs="Courier New"/>
+      </w:rPr>
+      <w:start w:val="1"/>
+      <w:suff w:val="tab"/>
+    </w:lvl>
+    <w:lvl w:ilvl="5">
+      <w:isLgl w:val="false"/>
+      <w:lvlJc w:val="left"/>
+      <w:lvlText w:val="§"/>
+      <w:numFmt w:val="bullet"/>
+      <w:pPr>
+        <w:pBdr/>
+        <w:spacing/>
+        <w:ind w:hanging="360" w:left="4309"/>
+      </w:pPr>
+      <w:rPr>
+        <w:rFonts w:hint="default" w:ascii="Wingdings" w:hAnsi="Wingdings" w:eastAsia="Wingdings" w:cs="Wingdings"/>
+      </w:rPr>
+      <w:start w:val="1"/>
+      <w:suff w:val="tab"/>
+    </w:lvl>
+    <w:lvl w:ilvl="6">
+      <w:isLgl w:val="false"/>
+      <w:lvlJc w:val="left"/>
+      <w:lvlText w:val="·"/>
+      <w:numFmt w:val="bullet"/>
+      <w:pPr>
+        <w:pBdr/>
+        <w:spacing/>
+        <w:ind w:hanging="360" w:left="5029"/>
+      </w:pPr>
+      <w:rPr>
+        <w:rFonts w:hint="default" w:ascii="Symbol" w:hAnsi="Symbol" w:eastAsia="Symbol" w:cs="Symbol"/>
+      </w:rPr>
+      <w:start w:val="1"/>
+      <w:suff w:val="tab"/>
+    </w:lvl>
+    <w:lvl w:ilvl="7">
+      <w:isLgl w:val="false"/>
+      <w:lvlJc w:val="left"/>
+      <w:lvlText w:val="o"/>
+      <w:numFmt w:val="bullet"/>
+      <w:pPr>
+        <w:pBdr/>
+        <w:spacing/>
+        <w:ind w:hanging="360" w:left="5749"/>
+      </w:pPr>
+      <w:rPr>
+        <w:rFonts w:hint="default" w:ascii="Courier New" w:hAnsi="Courier New" w:eastAsia="Courier New" w:cs="Courier New"/>
+      </w:rPr>
+      <w:start w:val="1"/>
+      <w:suff w:val="tab"/>
+    </w:lvl>
+    <w:lvl w:ilvl="8">
+      <w:isLgl w:val="false"/>
+      <w:lvlJc w:val="left"/>
+      <w:lvlText w:val="§"/>
+      <w:numFmt w:val="bullet"/>
+      <w:pPr>
+        <w:pBdr/>
+        <w:spacing/>
+        <w:ind w:hanging="360" w:left="6469"/>
+      </w:pPr>
+      <w:rPr>
+        <w:rFonts w:hint="default" w:ascii="Wingdings" w:hAnsi="Wingdings" w:eastAsia="Wingdings" w:cs="Wingdings"/>
+      </w:rPr>
+      <w:start w:val="1"/>
+      <w:suff w:val="tab"/>
+    </w:lvl>
+  </w:abstractNum>
+  <w:abstractNum w:abstractNumId="10">
+    <w:nsid w:val="20C38015"/>
+    <w:lvl w:ilvl="0">
+      <w:isLgl w:val="false"/>
+      <w:lvlJc w:val="left"/>
+      <w:lvlText w:val="·"/>
+      <w:numFmt w:val="bullet"/>
+      <w:pPr>
+        <w:pBdr/>
+        <w:spacing/>
+        <w:ind w:hanging="360" w:left="709"/>
+      </w:pPr>
+      <w:rPr>
+        <w:rFonts w:hint="default" w:ascii="Symbol" w:hAnsi="Symbol" w:eastAsia="Symbol" w:cs="Symbol"/>
+        <w:color w:val="000000"/>
+        <w:sz w:val="24"/>
+      </w:rPr>
+      <w:start w:val="1"/>
+      <w:suff w:val="tab"/>
+    </w:lvl>
+    <w:lvl w:ilvl="1">
+      <w:isLgl w:val="false"/>
+      <w:lvlJc w:val="left"/>
+      <w:lvlText w:val="o"/>
+      <w:numFmt w:val="bullet"/>
+      <w:pPr>
+        <w:pBdr/>
+        <w:spacing/>
+        <w:ind w:hanging="360" w:left="1429"/>
+      </w:pPr>
+      <w:rPr>
+        <w:rFonts w:hint="default" w:ascii="Courier New" w:hAnsi="Courier New" w:eastAsia="Courier New" w:cs="Courier New"/>
+      </w:rPr>
+      <w:start w:val="1"/>
+      <w:suff w:val="tab"/>
+    </w:lvl>
+    <w:lvl w:ilvl="2">
+      <w:isLgl w:val="false"/>
+      <w:lvlJc w:val="left"/>
+      <w:lvlText w:val="§"/>
+      <w:numFmt w:val="bullet"/>
+      <w:pPr>
+        <w:pBdr/>
+        <w:spacing/>
+        <w:ind w:hanging="360" w:left="2149"/>
+      </w:pPr>
+      <w:rPr>
+        <w:rFonts w:hint="default" w:ascii="Wingdings" w:hAnsi="Wingdings" w:eastAsia="Wingdings" w:cs="Wingdings"/>
+      </w:rPr>
+      <w:start w:val="1"/>
+      <w:suff w:val="tab"/>
+    </w:lvl>
+    <w:lvl w:ilvl="3">
+      <w:isLgl w:val="false"/>
+      <w:lvlJc w:val="left"/>
+      <w:lvlText w:val="·"/>
+      <w:numFmt w:val="bullet"/>
+      <w:pPr>
+        <w:pBdr/>
+        <w:spacing/>
+        <w:ind w:hanging="360" w:left="2869"/>
+      </w:pPr>
+      <w:rPr>
+        <w:rFonts w:hint="default" w:ascii="Symbol" w:hAnsi="Symbol" w:eastAsia="Symbol" w:cs="Symbol"/>
+      </w:rPr>
+      <w:start w:val="1"/>
+      <w:suff w:val="tab"/>
+    </w:lvl>
+    <w:lvl w:ilvl="4">
+      <w:isLgl w:val="false"/>
+      <w:lvlJc w:val="left"/>
+      <w:lvlText w:val="o"/>
+      <w:numFmt w:val="bullet"/>
+      <w:pPr>
+        <w:pBdr/>
+        <w:spacing/>
+        <w:ind w:hanging="360" w:left="3589"/>
+      </w:pPr>
+      <w:rPr>
+        <w:rFonts w:hint="default" w:ascii="Courier New" w:hAnsi="Courier New" w:eastAsia="Courier New" w:cs="Courier New"/>
+      </w:rPr>
+      <w:start w:val="1"/>
+      <w:suff w:val="tab"/>
+    </w:lvl>
+    <w:lvl w:ilvl="5">
+      <w:isLgl w:val="false"/>
+      <w:lvlJc w:val="left"/>
+      <w:lvlText w:val="§"/>
+      <w:numFmt w:val="bullet"/>
+      <w:pPr>
+        <w:pBdr/>
+        <w:spacing/>
+        <w:ind w:hanging="360" w:left="4309"/>
+      </w:pPr>
+      <w:rPr>
+        <w:rFonts w:hint="default" w:ascii="Wingdings" w:hAnsi="Wingdings" w:eastAsia="Wingdings" w:cs="Wingdings"/>
+      </w:rPr>
+      <w:start w:val="1"/>
+      <w:suff w:val="tab"/>
+    </w:lvl>
+    <w:lvl w:ilvl="6">
+      <w:isLgl w:val="false"/>
+      <w:lvlJc w:val="left"/>
+      <w:lvlText w:val="·"/>
+      <w:numFmt w:val="bullet"/>
+      <w:pPr>
+        <w:pBdr/>
+        <w:spacing/>
+        <w:ind w:hanging="360" w:left="5029"/>
+      </w:pPr>
+      <w:rPr>
+        <w:rFonts w:hint="default" w:ascii="Symbol" w:hAnsi="Symbol" w:eastAsia="Symbol" w:cs="Symbol"/>
+      </w:rPr>
+      <w:start w:val="1"/>
+      <w:suff w:val="tab"/>
+    </w:lvl>
+    <w:lvl w:ilvl="7">
+      <w:isLgl w:val="false"/>
+      <w:lvlJc w:val="left"/>
+      <w:lvlText w:val="o"/>
+      <w:numFmt w:val="bullet"/>
+      <w:pPr>
+        <w:pBdr/>
+        <w:spacing/>
+        <w:ind w:hanging="360" w:left="5749"/>
+      </w:pPr>
+      <w:rPr>
+        <w:rFonts w:hint="default" w:ascii="Courier New" w:hAnsi="Courier New" w:eastAsia="Courier New" w:cs="Courier New"/>
+      </w:rPr>
+      <w:start w:val="1"/>
+      <w:suff w:val="tab"/>
+    </w:lvl>
+    <w:lvl w:ilvl="8">
+      <w:isLgl w:val="false"/>
+      <w:lvlJc w:val="left"/>
+      <w:lvlText w:val="§"/>
+      <w:numFmt w:val="bullet"/>
+      <w:pPr>
+        <w:pBdr/>
+        <w:spacing/>
+        <w:ind w:hanging="360" w:left="6469"/>
+      </w:pPr>
+      <w:rPr>
+        <w:rFonts w:hint="default" w:ascii="Wingdings" w:hAnsi="Wingdings" w:eastAsia="Wingdings" w:cs="Wingdings"/>
+      </w:rPr>
+      <w:start w:val="1"/>
+      <w:suff w:val="tab"/>
+    </w:lvl>
+  </w:abstractNum>
+  <w:abstractNum w:abstractNumId="11">
+    <w:nsid w:val="650CE4A5"/>
+    <w:lvl w:ilvl="0">
+      <w:isLgl w:val="false"/>
+      <w:lvlJc w:val="left"/>
+      <w:lvlText w:val="·"/>
+      <w:numFmt w:val="bullet"/>
+      <w:pPr>
+        <w:pBdr/>
+        <w:spacing/>
+        <w:ind w:hanging="360" w:left="709"/>
+      </w:pPr>
+      <w:rPr>
+        <w:rFonts w:hint="default" w:ascii="Symbol" w:hAnsi="Symbol" w:eastAsia="Symbol" w:cs="Symbol"/>
+      </w:rPr>
+      <w:start w:val="1"/>
+      <w:suff w:val="tab"/>
+    </w:lvl>
+    <w:lvl w:ilvl="1">
+      <w:isLgl w:val="false"/>
+      <w:lvlJc w:val="left"/>
+      <w:lvlText w:val="o"/>
+      <w:numFmt w:val="bullet"/>
+      <w:pPr>
+        <w:pBdr/>
+        <w:spacing/>
+        <w:ind w:hanging="360" w:left="1429"/>
+      </w:pPr>
+      <w:rPr>
+        <w:rFonts w:hint="default" w:ascii="Courier New" w:hAnsi="Courier New" w:eastAsia="Courier New" w:cs="Courier New"/>
+      </w:rPr>
+      <w:start w:val="1"/>
+      <w:suff w:val="tab"/>
+    </w:lvl>
+    <w:lvl w:ilvl="2">
+      <w:isLgl w:val="false"/>
+      <w:lvlJc w:val="left"/>
+      <w:lvlText w:val="§"/>
+      <w:numFmt w:val="bullet"/>
+      <w:pPr>
+        <w:pBdr/>
+        <w:spacing/>
+        <w:ind w:hanging="360" w:left="2149"/>
+      </w:pPr>
+      <w:rPr>
+        <w:rFonts w:hint="default" w:ascii="Wingdings" w:hAnsi="Wingdings" w:eastAsia="Wingdings" w:cs="Wingdings"/>
+      </w:rPr>
+      <w:start w:val="1"/>
+      <w:suff w:val="tab"/>
+    </w:lvl>
+    <w:lvl w:ilvl="3">
+      <w:isLgl w:val="false"/>
+      <w:lvlJc w:val="left"/>
+      <w:lvlText w:val="·"/>
+      <w:numFmt w:val="bullet"/>
+      <w:pPr>
+        <w:pBdr/>
+        <w:spacing/>
+        <w:ind w:hanging="360" w:left="2869"/>
+      </w:pPr>
+      <w:rPr>
+        <w:rFonts w:hint="default" w:ascii="Symbol" w:hAnsi="Symbol" w:eastAsia="Symbol" w:cs="Symbol"/>
+      </w:rPr>
+      <w:start w:val="1"/>
+      <w:suff w:val="tab"/>
+    </w:lvl>
+    <w:lvl w:ilvl="4">
+      <w:isLgl w:val="false"/>
+      <w:lvlJc w:val="left"/>
+      <w:lvlText w:val="o"/>
+      <w:numFmt w:val="bullet"/>
+      <w:pPr>
+        <w:pBdr/>
+        <w:spacing/>
+        <w:ind w:hanging="360" w:left="3589"/>
+      </w:pPr>
+      <w:rPr>
+        <w:rFonts w:hint="default" w:ascii="Courier New" w:hAnsi="Courier New" w:eastAsia="Courier New" w:cs="Courier New"/>
+      </w:rPr>
+      <w:start w:val="1"/>
+      <w:suff w:val="tab"/>
+    </w:lvl>
+    <w:lvl w:ilvl="5">
+      <w:isLgl w:val="false"/>
+      <w:lvlJc w:val="left"/>
+      <w:lvlText w:val="§"/>
+      <w:numFmt w:val="bullet"/>
+      <w:pPr>
+        <w:pBdr/>
+        <w:spacing/>
+        <w:ind w:hanging="360" w:left="4309"/>
+      </w:pPr>
+      <w:rPr>
+        <w:rFonts w:hint="default" w:ascii="Wingdings" w:hAnsi="Wingdings" w:eastAsia="Wingdings" w:cs="Wingdings"/>
+      </w:rPr>
+      <w:start w:val="1"/>
+      <w:suff w:val="tab"/>
+    </w:lvl>
+    <w:lvl w:ilvl="6">
+      <w:isLgl w:val="false"/>
+      <w:lvlJc w:val="left"/>
+      <w:lvlText w:val="·"/>
+      <w:numFmt w:val="bullet"/>
+      <w:pPr>
+        <w:pBdr/>
+        <w:spacing/>
+        <w:ind w:hanging="360" w:left="5029"/>
+      </w:pPr>
+      <w:rPr>
+        <w:rFonts w:hint="default" w:ascii="Symbol" w:hAnsi="Symbol" w:eastAsia="Symbol" w:cs="Symbol"/>
+      </w:rPr>
+      <w:start w:val="1"/>
+      <w:suff w:val="tab"/>
+    </w:lvl>
+    <w:lvl w:ilvl="7">
+      <w:isLgl w:val="false"/>
+      <w:lvlJc w:val="left"/>
+      <w:lvlText w:val="o"/>
+      <w:numFmt w:val="bullet"/>
+      <w:pPr>
+        <w:pBdr/>
+        <w:spacing/>
+        <w:ind w:hanging="360" w:left="5749"/>
+      </w:pPr>
+      <w:rPr>
+        <w:rFonts w:hint="default" w:ascii="Courier New" w:hAnsi="Courier New" w:eastAsia="Courier New" w:cs="Courier New"/>
+      </w:rPr>
+      <w:start w:val="1"/>
+      <w:suff w:val="tab"/>
+    </w:lvl>
+    <w:lvl w:ilvl="8">
+      <w:isLgl w:val="false"/>
+      <w:lvlJc w:val="left"/>
+      <w:lvlText w:val="§"/>
+      <w:numFmt w:val="bullet"/>
+      <w:pPr>
+        <w:pBdr/>
+        <w:spacing/>
+        <w:ind w:hanging="360" w:left="6469"/>
+      </w:pPr>
+      <w:rPr>
+        <w:rFonts w:hint="default" w:ascii="Wingdings" w:hAnsi="Wingdings" w:eastAsia="Wingdings" w:cs="Wingdings"/>
+      </w:rPr>
+      <w:start w:val="1"/>
+      <w:suff w:val="tab"/>
+    </w:lvl>
+  </w:abstractNum>
+  <w:abstractNum w:abstractNumId="12">
+    <w:nsid w:val="7757F002"/>
+    <w:lvl w:ilvl="0">
+      <w:isLgl w:val="false"/>
+      <w:lvlJc w:val="left"/>
+      <w:lvlText w:val="·"/>
+      <w:numFmt w:val="bullet"/>
+      <w:pPr>
+        <w:pBdr/>
+        <w:spacing/>
+        <w:ind w:hanging="360" w:left="709"/>
+      </w:pPr>
+      <w:rPr>
+        <w:rFonts w:hint="default" w:ascii="Symbol" w:hAnsi="Symbol" w:eastAsia="Symbol" w:cs="Symbol"/>
+      </w:rPr>
+      <w:start w:val="1"/>
+      <w:suff w:val="tab"/>
+    </w:lvl>
+    <w:lvl w:ilvl="1">
+      <w:isLgl w:val="false"/>
+      <w:lvlJc w:val="left"/>
+      <w:lvlText w:val="o"/>
+      <w:numFmt w:val="bullet"/>
+      <w:pPr>
+        <w:pBdr/>
+        <w:spacing/>
+        <w:ind w:hanging="360" w:left="1429"/>
+      </w:pPr>
+      <w:rPr>
+        <w:rFonts w:hint="default" w:ascii="Courier New" w:hAnsi="Courier New" w:eastAsia="Courier New" w:cs="Courier New"/>
+      </w:rPr>
+      <w:start w:val="1"/>
+      <w:suff w:val="tab"/>
+    </w:lvl>
+    <w:lvl w:ilvl="2">
+      <w:isLgl w:val="false"/>
+      <w:lvlJc w:val="left"/>
+      <w:lvlText w:val="§"/>
+      <w:numFmt w:val="bullet"/>
+      <w:pPr>
+        <w:pBdr/>
+        <w:spacing/>
+        <w:ind w:hanging="360" w:left="2149"/>
+      </w:pPr>
+      <w:rPr>
+        <w:rFonts w:hint="default" w:ascii="Wingdings" w:hAnsi="Wingdings" w:eastAsia="Wingdings" w:cs="Wingdings"/>
+      </w:rPr>
+      <w:start w:val="1"/>
+      <w:suff w:val="tab"/>
+    </w:lvl>
+    <w:lvl w:ilvl="3">
+      <w:isLgl w:val="false"/>
+      <w:lvlJc w:val="left"/>
+      <w:lvlText w:val="·"/>
+      <w:numFmt w:val="bullet"/>
+      <w:pPr>
+        <w:pBdr/>
+        <w:spacing/>
+        <w:ind w:hanging="360" w:left="2869"/>
+      </w:pPr>
+      <w:rPr>
+        <w:rFonts w:hint="default" w:ascii="Symbol" w:hAnsi="Symbol" w:eastAsia="Symbol" w:cs="Symbol"/>
+      </w:rPr>
+      <w:start w:val="1"/>
+      <w:suff w:val="tab"/>
+    </w:lvl>
+    <w:lvl w:ilvl="4">
+      <w:isLgl w:val="false"/>
+      <w:lvlJc w:val="left"/>
+      <w:lvlText w:val="o"/>
+      <w:numFmt w:val="bullet"/>
+      <w:pPr>
+        <w:pBdr/>
+        <w:spacing/>
+        <w:ind w:hanging="360" w:left="3589"/>
+      </w:pPr>
+      <w:rPr>
+        <w:rFonts w:hint="default" w:ascii="Courier New" w:hAnsi="Courier New" w:eastAsia="Courier New" w:cs="Courier New"/>
+      </w:rPr>
+      <w:start w:val="1"/>
+      <w:suff w:val="tab"/>
+    </w:lvl>
+    <w:lvl w:ilvl="5">
+      <w:isLgl w:val="false"/>
+      <w:lvlJc w:val="left"/>
+      <w:lvlText w:val="§"/>
+      <w:numFmt w:val="bullet"/>
+      <w:pPr>
+        <w:pBdr/>
+        <w:spacing/>
+        <w:ind w:hanging="360" w:left="4309"/>
+      </w:pPr>
+      <w:rPr>
+        <w:rFonts w:hint="default" w:ascii="Wingdings" w:hAnsi="Wingdings" w:eastAsia="Wingdings" w:cs="Wingdings"/>
+      </w:rPr>
+      <w:start w:val="1"/>
+      <w:suff w:val="tab"/>
+    </w:lvl>
+    <w:lvl w:ilvl="6">
+      <w:isLgl w:val="false"/>
+      <w:lvlJc w:val="left"/>
+      <w:lvlText w:val="·"/>
+      <w:numFmt w:val="bullet"/>
+      <w:pPr>
+        <w:pBdr/>
+        <w:spacing/>
+        <w:ind w:hanging="360" w:left="5029"/>
+      </w:pPr>
+      <w:rPr>
+        <w:rFonts w:hint="default" w:ascii="Symbol" w:hAnsi="Symbol" w:eastAsia="Symbol" w:cs="Symbol"/>
+      </w:rPr>
+      <w:start w:val="1"/>
+      <w:suff w:val="tab"/>
+    </w:lvl>
+    <w:lvl w:ilvl="7">
+      <w:isLgl w:val="false"/>
+      <w:lvlJc w:val="left"/>
+      <w:lvlText w:val="o"/>
+      <w:numFmt w:val="bullet"/>
+      <w:pPr>
+        <w:pBdr/>
+        <w:spacing/>
+        <w:ind w:hanging="360" w:left="5749"/>
+      </w:pPr>
+      <w:rPr>
+        <w:rFonts w:hint="default" w:ascii="Courier New" w:hAnsi="Courier New" w:eastAsia="Courier New" w:cs="Courier New"/>
+      </w:rPr>
+      <w:start w:val="1"/>
+      <w:suff w:val="tab"/>
+    </w:lvl>
+    <w:lvl w:ilvl="8">
+      <w:isLgl w:val="false"/>
+      <w:lvlJc w:val="left"/>
+      <w:lvlText w:val="§"/>
+      <w:numFmt w:val="bullet"/>
+      <w:pPr>
+        <w:pBdr/>
+        <w:spacing/>
+        <w:ind w:hanging="360" w:left="6469"/>
+      </w:pPr>
+      <w:rPr>
+        <w:rFonts w:hint="default" w:ascii="Wingdings" w:hAnsi="Wingdings" w:eastAsia="Wingdings" w:cs="Wingdings"/>
+      </w:rPr>
+      <w:start w:val="1"/>
+      <w:suff w:val="tab"/>
+    </w:lvl>
+  </w:abstractNum>
   <w:num w:numId="1">
     <w:abstractNumId w:val="0"/>
   </w:num>
@@ -2388,6 +6216,33 @@
   </w:num>
   <w:num w:numId="4">
     <w:abstractNumId w:val="3"/>
+  </w:num>
+  <w:num w:numId="5">
+    <w:abstractNumId w:val="4"/>
+  </w:num>
+  <w:num w:numId="6">
+    <w:abstractNumId w:val="5"/>
+  </w:num>
+  <w:num w:numId="7">
+    <w:abstractNumId w:val="6"/>
+  </w:num>
+  <w:num w:numId="8">
+    <w:abstractNumId w:val="7"/>
+  </w:num>
+  <w:num w:numId="9">
+    <w:abstractNumId w:val="8"/>
+  </w:num>
+  <w:num w:numId="10">
+    <w:abstractNumId w:val="9"/>
+  </w:num>
+  <w:num w:numId="11">
+    <w:abstractNumId w:val="10"/>
+  </w:num>
+  <w:num w:numId="12">
+    <w:abstractNumId w:val="11"/>
+  </w:num>
+  <w:num w:numId="13">
+    <w:abstractNumId w:val="12"/>
   </w:num>
 </w:numbering>
 </file>

</xml_diff>